<commit_message>
V4.1 guides: User Guide + Quick Reference updated with Edit Answers, Satisfaction Gate, User AI panel, PDF AI disclosure, branding defaults
</commit_message>
<xml_diff>
--- a/ESG_Toolkit_V4_QuickReference.docx
+++ b/ESG_Toolkit_V4_QuickReference.docx
@@ -4,20 +4,7 @@
   <w:body>
     <w:p>
       <w:pPr>
-        <w:jc w:val="right"/>
-      </w:pPr>
-      <w:r>
-        <w:rPr>
-          <w:b/>
-          <w:color w:val="1A6B3C"/>
-          <w:sz w:val="16"/>
-        </w:rPr>
-        <w:t>OFFICIAL HANDOUT // ESG HEALTH CHECK TOOLKIT V4.0</w:t>
-      </w:r>
-    </w:p>
-    <w:p>
-      <w:pPr>
-        <w:spacing w:after="360"/>
+        <w:jc w:val="center"/>
       </w:pPr>
       <w:r>
         <w:rPr>
@@ -25,110 +12,74 @@
           <w:color w:val="1A6B3C"/>
           <w:sz w:val="44"/>
         </w:rPr>
-        <w:t>ESG Health Check Tool — Quick Reference Guide</w:t>
+        <w:t>ESG Health Check — Quick Reference Card</w:t>
       </w:r>
     </w:p>
     <w:p>
       <w:pPr>
-        <w:pStyle w:val="Heading1"/>
+        <w:jc w:val="center"/>
       </w:pPr>
       <w:r>
-        <w:t>ESG Compliance &amp; Carbon Hub — Quick Reference Guide</w:t>
+        <w:rPr>
+          <w:color w:val="6B8A75"/>
+          <w:sz w:val="20"/>
+        </w:rPr>
+        <w:t>Version 4.1  |  June 2026  |  i-nocarbon</w:t>
       </w:r>
     </w:p>
-    <w:p>
-      <w:r>
-        <w:t>This reference guide provides a quick lookup for tooltips, emission factor coefficients, pricing rates, and B-Corp fees.</w:t>
-      </w:r>
-    </w:p>
+    <w:p/>
     <w:p>
       <w:pPr>
         <w:pStyle w:val="Heading1"/>
+        <w:spacing w:before="280" w:after="80"/>
       </w:pPr>
       <w:r>
-        <w:t>1. Tab &amp; Screen Quick Map</w:t>
+        <w:rPr>
+          <w:color w:val="1A6B3C"/>
+        </w:rPr>
+        <w:t>Assessment Flow</w:t>
       </w:r>
     </w:p>
     <w:tbl>
       <w:tblPr>
+        <w:tblStyle w:val="TableGrid"/>
         <w:tblW w:type="auto" w:w="0"/>
-        <w:jc w:val="center"/>
         <w:tblLook w:firstColumn="1" w:firstRow="1" w:lastColumn="0" w:lastRow="0" w:noHBand="0" w:noVBand="1" w:val="04A0"/>
-        <w:tblBorders>
-          <w:top w:val="single" w:sz="4" w:space="0" w:color="D6EDDF"/>
-          <w:left w:val="single" w:sz="4" w:space="0" w:color="D6EDDF"/>
-          <w:bottom w:val="single" w:sz="4" w:space="0" w:color="D6EDDF"/>
-          <w:right w:val="single" w:sz="4" w:space="0" w:color="D6EDDF"/>
-          <w:insideH w:val="single" w:sz="4" w:space="0" w:color="D6EDDF"/>
-          <w:insideV w:val="single" w:sz="4" w:space="0" w:color="D6EDDF"/>
-        </w:tblBorders>
       </w:tblPr>
       <w:tblGrid>
-        <w:gridCol w:w="3120"/>
-        <w:gridCol w:w="3120"/>
-        <w:gridCol w:w="3120"/>
+        <w:gridCol w:w="4986"/>
+        <w:gridCol w:w="4986"/>
       </w:tblGrid>
       <w:tr>
         <w:tc>
           <w:tcPr>
-            <w:tcW w:type="dxa" w:w="3120"/>
-            <w:shd w:fill="0F2318"/>
-            <w:tcMar>
-              <w:top w:w="80" w:type="dxa"/>
-              <w:bottom w:w="80" w:type="dxa"/>
-              <w:left w:w="100" w:type="dxa"/>
-              <w:right w:w="100" w:type="dxa"/>
-            </w:tcMar>
+            <w:tcW w:type="dxa" w:w="4986"/>
+            <w:shd w:val="clear" w:color="auto" w:fill="1A6B3C"/>
           </w:tcPr>
           <w:p>
             <w:r>
               <w:rPr>
                 <w:b/>
                 <w:color w:val="FFFFFF"/>
+                <w:sz w:val="18"/>
               </w:rPr>
-              <w:t>Tab ID</w:t>
+              <w:t>Step</w:t>
             </w:r>
           </w:p>
         </w:tc>
         <w:tc>
           <w:tcPr>
-            <w:tcW w:type="dxa" w:w="3120"/>
-            <w:shd w:fill="0F2318"/>
-            <w:tcMar>
-              <w:top w:w="80" w:type="dxa"/>
-              <w:bottom w:w="80" w:type="dxa"/>
-              <w:left w:w="100" w:type="dxa"/>
-              <w:right w:w="100" w:type="dxa"/>
-            </w:tcMar>
+            <w:tcW w:type="dxa" w:w="4986"/>
+            <w:shd w:val="clear" w:color="auto" w:fill="1A6B3C"/>
           </w:tcPr>
           <w:p>
             <w:r>
               <w:rPr>
                 <w:b/>
                 <w:color w:val="FFFFFF"/>
+                <w:sz w:val="18"/>
               </w:rPr>
-              <w:t>Nav Label</w:t>
-            </w:r>
-          </w:p>
-        </w:tc>
-        <w:tc>
-          <w:tcPr>
-            <w:tcW w:type="dxa" w:w="3120"/>
-            <w:shd w:fill="0F2318"/>
-            <w:tcMar>
-              <w:top w:w="80" w:type="dxa"/>
-              <w:bottom w:w="80" w:type="dxa"/>
-              <w:left w:w="100" w:type="dxa"/>
-              <w:right w:w="100" w:type="dxa"/>
-            </w:tcMar>
-          </w:tcPr>
-          <w:p>
-            <w:r>
-              <w:rPr>
-                <w:b/>
-                <w:color w:val="FFFFFF"/>
-              </w:rPr>
-              <w:t>Primary Objective</w:t>
+              <w:t>Action</w:t>
             </w:r>
           </w:p>
         </w:tc>
@@ -136,64 +87,29 @@
       <w:tr>
         <w:tc>
           <w:tcPr>
-            <w:tcW w:type="dxa" w:w="3120"/>
-            <w:shd w:fill="F6F9F7"/>
-            <w:tcMar>
-              <w:top w:w="80" w:type="dxa"/>
-              <w:bottom w:w="80" w:type="dxa"/>
-              <w:left w:w="100" w:type="dxa"/>
-              <w:right w:w="100" w:type="dxa"/>
-            </w:tcMar>
+            <w:tcW w:type="dxa" w:w="4986"/>
+            <w:shd w:val="clear" w:color="auto" w:fill="F6F9F7"/>
           </w:tcPr>
           <w:p>
-            <w:r/>
             <w:r>
               <w:rPr>
-                <w:rFonts w:ascii="Consolas" w:hAnsi="Consolas"/>
-                <w:color w:val="C0392B"/>
-                <w:sz w:val="17"/>
+                <w:sz w:val="18"/>
               </w:rPr>
-              <w:t>diagnostic</w:t>
+              <w:t>Step 1</w:t>
             </w:r>
-            <w:r/>
           </w:p>
         </w:tc>
         <w:tc>
           <w:tcPr>
-            <w:tcW w:type="dxa" w:w="3120"/>
-            <w:shd w:fill="F6F9F7"/>
-            <w:tcMar>
-              <w:top w:w="80" w:type="dxa"/>
-              <w:bottom w:w="80" w:type="dxa"/>
-              <w:left w:w="100" w:type="dxa"/>
-              <w:right w:w="100" w:type="dxa"/>
-            </w:tcMar>
-          </w:tcPr>
-          <w:p>
-            <w:r/>
-            <w:r>
-              <w:rPr>
-                <w:b/>
-              </w:rPr>
-              <w:t>ESG Diagnostic</w:t>
-            </w:r>
-            <w:r/>
-          </w:p>
-        </w:tc>
-        <w:tc>
-          <w:tcPr>
-            <w:tcW w:type="dxa" w:w="3120"/>
-            <w:shd w:fill="F6F9F7"/>
-            <w:tcMar>
-              <w:top w:w="80" w:type="dxa"/>
-              <w:bottom w:w="80" w:type="dxa"/>
-              <w:left w:w="100" w:type="dxa"/>
-              <w:right w:w="100" w:type="dxa"/>
-            </w:tcMar>
+            <w:tcW w:type="dxa" w:w="4986"/>
+            <w:shd w:val="clear" w:color="auto" w:fill="F6F9F7"/>
           </w:tcPr>
           <w:p>
             <w:r>
-              <w:t>21-Question qualitative check to score ESG maturity (0-100 pts) and identify gaps.</w:t>
+              <w:rPr>
+                <w:sz w:val="18"/>
+              </w:rPr>
+              <w:t>Open the tool — welcome screen loads automatically</w:t>
             </w:r>
           </w:p>
         </w:tc>
@@ -201,64 +117,29 @@
       <w:tr>
         <w:tc>
           <w:tcPr>
-            <w:tcW w:type="dxa" w:w="3120"/>
-            <w:shd w:fill="FFFFFF"/>
-            <w:tcMar>
-              <w:top w:w="80" w:type="dxa"/>
-              <w:bottom w:w="80" w:type="dxa"/>
-              <w:left w:w="100" w:type="dxa"/>
-              <w:right w:w="100" w:type="dxa"/>
-            </w:tcMar>
+            <w:tcW w:type="dxa" w:w="4986"/>
+            <w:shd w:val="clear" w:color="auto" w:fill="FFFFFF"/>
           </w:tcPr>
           <w:p>
-            <w:r/>
             <w:r>
               <w:rPr>
-                <w:rFonts w:ascii="Consolas" w:hAnsi="Consolas"/>
-                <w:color w:val="C0392B"/>
-                <w:sz w:val="17"/>
+                <w:sz w:val="18"/>
               </w:rPr>
-              <w:t>intake</w:t>
+              <w:t>Step 2</w:t>
             </w:r>
-            <w:r/>
           </w:p>
         </w:tc>
         <w:tc>
           <w:tcPr>
-            <w:tcW w:type="dxa" w:w="3120"/>
-            <w:shd w:fill="FFFFFF"/>
-            <w:tcMar>
-              <w:top w:w="80" w:type="dxa"/>
-              <w:bottom w:w="80" w:type="dxa"/>
-              <w:left w:w="100" w:type="dxa"/>
-              <w:right w:w="100" w:type="dxa"/>
-            </w:tcMar>
-          </w:tcPr>
-          <w:p>
-            <w:r/>
-            <w:r>
-              <w:rPr>
-                <w:b/>
-              </w:rPr>
-              <w:t>Setup &amp; Intake</w:t>
-            </w:r>
-            <w:r/>
-          </w:p>
-        </w:tc>
-        <w:tc>
-          <w:tcPr>
-            <w:tcW w:type="dxa" w:w="3120"/>
-            <w:shd w:fill="FFFFFF"/>
-            <w:tcMar>
-              <w:top w:w="80" w:type="dxa"/>
-              <w:bottom w:w="80" w:type="dxa"/>
-              <w:left w:w="100" w:type="dxa"/>
-              <w:right w:w="100" w:type="dxa"/>
-            </w:tcMar>
+            <w:tcW w:type="dxa" w:w="4986"/>
+            <w:shd w:val="clear" w:color="auto" w:fill="FFFFFF"/>
           </w:tcPr>
           <w:p>
             <w:r>
-              <w:t>Establish company boundary, material topics, and active disclosure frameworks.</w:t>
+              <w:rPr>
+                <w:sz w:val="18"/>
+              </w:rPr>
+              <w:t>Click '🚀 Start Assessment' → mode cards pulse green → choose Grouped by Theme or One at a Time</w:t>
             </w:r>
           </w:p>
         </w:tc>
@@ -266,64 +147,29 @@
       <w:tr>
         <w:tc>
           <w:tcPr>
-            <w:tcW w:type="dxa" w:w="3120"/>
-            <w:shd w:fill="F6F9F7"/>
-            <w:tcMar>
-              <w:top w:w="80" w:type="dxa"/>
-              <w:bottom w:w="80" w:type="dxa"/>
-              <w:left w:w="100" w:type="dxa"/>
-              <w:right w:w="100" w:type="dxa"/>
-            </w:tcMar>
+            <w:tcW w:type="dxa" w:w="4986"/>
+            <w:shd w:val="clear" w:color="auto" w:fill="F6F9F7"/>
           </w:tcPr>
           <w:p>
-            <w:r/>
             <w:r>
               <w:rPr>
-                <w:rFonts w:ascii="Consolas" w:hAnsi="Consolas"/>
-                <w:color w:val="C0392B"/>
-                <w:sz w:val="17"/>
+                <w:sz w:val="18"/>
               </w:rPr>
-              <w:t>questionnaire</w:t>
+              <w:t>Step 3</w:t>
             </w:r>
-            <w:r/>
           </w:p>
         </w:tc>
         <w:tc>
           <w:tcPr>
-            <w:tcW w:type="dxa" w:w="3120"/>
-            <w:shd w:fill="F6F9F7"/>
-            <w:tcMar>
-              <w:top w:w="80" w:type="dxa"/>
-              <w:bottom w:w="80" w:type="dxa"/>
-              <w:left w:w="100" w:type="dxa"/>
-              <w:right w:w="100" w:type="dxa"/>
-            </w:tcMar>
-          </w:tcPr>
-          <w:p>
-            <w:r/>
-            <w:r>
-              <w:rPr>
-                <w:b/>
-              </w:rPr>
-              <w:t>Audit Questionnaire</w:t>
-            </w:r>
-            <w:r/>
-          </w:p>
-        </w:tc>
-        <w:tc>
-          <w:tcPr>
-            <w:tcW w:type="dxa" w:w="3120"/>
-            <w:shd w:fill="F6F9F7"/>
-            <w:tcMar>
-              <w:top w:w="80" w:type="dxa"/>
-              <w:bottom w:w="80" w:type="dxa"/>
-              <w:left w:w="100" w:type="dxa"/>
-              <w:right w:w="100" w:type="dxa"/>
-            </w:tcMar>
+            <w:tcW w:type="dxa" w:w="4986"/>
+            <w:shd w:val="clear" w:color="auto" w:fill="F6F9F7"/>
           </w:tcPr>
           <w:p>
             <w:r>
-              <w:t>Draft compliance disclosures for active frameworks (supports AI drafts).</w:t>
+              <w:rPr>
+                <w:sz w:val="18"/>
+              </w:rPr>
+              <w:t>Answer all 21 questions across 6 ESG dimensions</w:t>
             </w:r>
           </w:p>
         </w:tc>
@@ -331,64 +177,29 @@
       <w:tr>
         <w:tc>
           <w:tcPr>
-            <w:tcW w:type="dxa" w:w="3120"/>
-            <w:shd w:fill="FFFFFF"/>
-            <w:tcMar>
-              <w:top w:w="80" w:type="dxa"/>
-              <w:bottom w:w="80" w:type="dxa"/>
-              <w:left w:w="100" w:type="dxa"/>
-              <w:right w:w="100" w:type="dxa"/>
-            </w:tcMar>
+            <w:tcW w:type="dxa" w:w="4986"/>
+            <w:shd w:val="clear" w:color="auto" w:fill="FFFFFF"/>
           </w:tcPr>
           <w:p>
-            <w:r/>
             <w:r>
               <w:rPr>
-                <w:rFonts w:ascii="Consolas" w:hAnsi="Consolas"/>
-                <w:color w:val="C0392B"/>
-                <w:sz w:val="17"/>
+                <w:sz w:val="18"/>
               </w:rPr>
-              <w:t>carbon</w:t>
+              <w:t>Step 4</w:t>
             </w:r>
-            <w:r/>
           </w:p>
         </w:tc>
         <w:tc>
           <w:tcPr>
-            <w:tcW w:type="dxa" w:w="3120"/>
-            <w:shd w:fill="FFFFFF"/>
-            <w:tcMar>
-              <w:top w:w="80" w:type="dxa"/>
-              <w:bottom w:w="80" w:type="dxa"/>
-              <w:left w:w="100" w:type="dxa"/>
-              <w:right w:w="100" w:type="dxa"/>
-            </w:tcMar>
-          </w:tcPr>
-          <w:p>
-            <w:r/>
-            <w:r>
-              <w:rPr>
-                <w:b/>
-              </w:rPr>
-              <w:t>Carbon Calculator</w:t>
-            </w:r>
-            <w:r/>
-          </w:p>
-        </w:tc>
-        <w:tc>
-          <w:tcPr>
-            <w:tcW w:type="dxa" w:w="3120"/>
-            <w:shd w:fill="FFFFFF"/>
-            <w:tcMar>
-              <w:top w:w="80" w:type="dxa"/>
-              <w:bottom w:w="80" w:type="dxa"/>
-              <w:left w:w="100" w:type="dxa"/>
-              <w:right w:w="100" w:type="dxa"/>
-            </w:tcMar>
+            <w:tcW w:type="dxa" w:w="4986"/>
+            <w:shd w:val="clear" w:color="auto" w:fill="FFFFFF"/>
           </w:tcPr>
           <w:p>
             <w:r>
-              <w:t>Input physical consumption metrics to compute Scope 1, 2, and 3 footprint.</w:t>
+              <w:rPr>
+                <w:sz w:val="18"/>
+              </w:rPr>
+              <w:t>Enter your details (name, organisation, sector, region — all optional)</w:t>
             </w:r>
           </w:p>
         </w:tc>
@@ -396,64 +207,29 @@
       <w:tr>
         <w:tc>
           <w:tcPr>
-            <w:tcW w:type="dxa" w:w="3120"/>
-            <w:shd w:fill="F6F9F7"/>
-            <w:tcMar>
-              <w:top w:w="80" w:type="dxa"/>
-              <w:bottom w:w="80" w:type="dxa"/>
-              <w:left w:w="100" w:type="dxa"/>
-              <w:right w:w="100" w:type="dxa"/>
-            </w:tcMar>
+            <w:tcW w:type="dxa" w:w="4986"/>
+            <w:shd w:val="clear" w:color="auto" w:fill="F6F9F7"/>
           </w:tcPr>
           <w:p>
-            <w:r/>
             <w:r>
               <w:rPr>
-                <w:rFonts w:ascii="Consolas" w:hAnsi="Consolas"/>
-                <w:color w:val="C0392B"/>
-                <w:sz w:val="17"/>
+                <w:sz w:val="18"/>
               </w:rPr>
-              <w:t>carbon-dashboard</w:t>
+              <w:t>Step 5</w:t>
             </w:r>
-            <w:r/>
           </w:p>
         </w:tc>
         <w:tc>
           <w:tcPr>
-            <w:tcW w:type="dxa" w:w="3120"/>
-            <w:shd w:fill="F6F9F7"/>
-            <w:tcMar>
-              <w:top w:w="80" w:type="dxa"/>
-              <w:bottom w:w="80" w:type="dxa"/>
-              <w:left w:w="100" w:type="dxa"/>
-              <w:right w:w="100" w:type="dxa"/>
-            </w:tcMar>
-          </w:tcPr>
-          <w:p>
-            <w:r/>
-            <w:r>
-              <w:rPr>
-                <w:b/>
-              </w:rPr>
-              <w:t>Carbon Dashboard</w:t>
-            </w:r>
-            <w:r/>
-          </w:p>
-        </w:tc>
-        <w:tc>
-          <w:tcPr>
-            <w:tcW w:type="dxa" w:w="3120"/>
-            <w:shd w:fill="F6F9F7"/>
-            <w:tcMar>
-              <w:top w:w="80" w:type="dxa"/>
-              <w:bottom w:w="80" w:type="dxa"/>
-              <w:left w:w="100" w:type="dxa"/>
-              <w:right w:w="100" w:type="dxa"/>
-            </w:tcMar>
+            <w:tcW w:type="dxa" w:w="4986"/>
+            <w:shd w:val="clear" w:color="auto" w:fill="F6F9F7"/>
           </w:tcPr>
           <w:p>
             <w:r>
-              <w:t>Interactive charts, recalculation warning banners, and top 3 project recommendations.</w:t>
+              <w:rPr>
+                <w:sz w:val="18"/>
+              </w:rPr>
+              <w:t>Click 'See My ESG Score →' → Satisfaction Gate appears</w:t>
             </w:r>
           </w:p>
         </w:tc>
@@ -461,64 +237,29 @@
       <w:tr>
         <w:tc>
           <w:tcPr>
-            <w:tcW w:type="dxa" w:w="3120"/>
-            <w:shd w:fill="FFFFFF"/>
-            <w:tcMar>
-              <w:top w:w="80" w:type="dxa"/>
-              <w:bottom w:w="80" w:type="dxa"/>
-              <w:left w:w="100" w:type="dxa"/>
-              <w:right w:w="100" w:type="dxa"/>
-            </w:tcMar>
+            <w:tcW w:type="dxa" w:w="4986"/>
+            <w:shd w:val="clear" w:color="auto" w:fill="FFFFFF"/>
           </w:tcPr>
           <w:p>
-            <w:r/>
             <w:r>
               <w:rPr>
-                <w:rFonts w:ascii="Consolas" w:hAnsi="Consolas"/>
-                <w:color w:val="C0392B"/>
-                <w:sz w:val="17"/>
+                <w:sz w:val="18"/>
               </w:rPr>
-              <w:t>bcorp</w:t>
+              <w:t>Step 6</w:t>
             </w:r>
-            <w:r/>
           </w:p>
         </w:tc>
         <w:tc>
           <w:tcPr>
-            <w:tcW w:type="dxa" w:w="3120"/>
-            <w:shd w:fill="FFFFFF"/>
-            <w:tcMar>
-              <w:top w:w="80" w:type="dxa"/>
-              <w:bottom w:w="80" w:type="dxa"/>
-              <w:left w:w="100" w:type="dxa"/>
-              <w:right w:w="100" w:type="dxa"/>
-            </w:tcMar>
-          </w:tcPr>
-          <w:p>
-            <w:r/>
-            <w:r>
-              <w:rPr>
-                <w:b/>
-              </w:rPr>
-              <w:t>B-Corp Pathway</w:t>
-            </w:r>
-            <w:r/>
-          </w:p>
-        </w:tc>
-        <w:tc>
-          <w:tcPr>
-            <w:tcW w:type="dxa" w:w="3120"/>
-            <w:shd w:fill="FFFFFF"/>
-            <w:tcMar>
-              <w:top w:w="80" w:type="dxa"/>
-              <w:bottom w:w="80" w:type="dxa"/>
-              <w:left w:w="100" w:type="dxa"/>
-              <w:right w:w="100" w:type="dxa"/>
-            </w:tcMar>
+            <w:tcW w:type="dxa" w:w="4986"/>
+            <w:shd w:val="clear" w:color="auto" w:fill="FFFFFF"/>
           </w:tcPr>
           <w:p>
             <w:r>
-              <w:t>eligibility checks, BIA progress checklist, and fee projection models.</w:t>
+              <w:rPr>
+                <w:sz w:val="18"/>
+              </w:rPr>
+              <w:t>Choose 'Edit My Answers' (review) or 'Yes, Show My Report' (proceed)</w:t>
             </w:r>
           </w:p>
         </w:tc>
@@ -526,442 +267,29 @@
       <w:tr>
         <w:tc>
           <w:tcPr>
-            <w:tcW w:type="dxa" w:w="3120"/>
-            <w:shd w:fill="F6F9F7"/>
-            <w:tcMar>
-              <w:top w:w="80" w:type="dxa"/>
-              <w:bottom w:w="80" w:type="dxa"/>
-              <w:left w:w="100" w:type="dxa"/>
-              <w:right w:w="100" w:type="dxa"/>
-            </w:tcMar>
-          </w:tcPr>
-          <w:p>
-            <w:r/>
-            <w:r>
-              <w:rPr>
-                <w:rFonts w:ascii="Consolas" w:hAnsi="Consolas"/>
-                <w:color w:val="C0392B"/>
-                <w:sz w:val="17"/>
-              </w:rPr>
-              <w:t>report</w:t>
-            </w:r>
-            <w:r/>
-          </w:p>
-        </w:tc>
-        <w:tc>
-          <w:tcPr>
-            <w:tcW w:type="dxa" w:w="3120"/>
-            <w:shd w:fill="F6F9F7"/>
-            <w:tcMar>
-              <w:top w:w="80" w:type="dxa"/>
-              <w:bottom w:w="80" w:type="dxa"/>
-              <w:left w:w="100" w:type="dxa"/>
-              <w:right w:w="100" w:type="dxa"/>
-            </w:tcMar>
-          </w:tcPr>
-          <w:p>
-            <w:r/>
-            <w:r>
-              <w:rPr>
-                <w:b/>
-              </w:rPr>
-              <w:t>Consolidated Report</w:t>
-            </w:r>
-            <w:r/>
-          </w:p>
-        </w:tc>
-        <w:tc>
-          <w:tcPr>
-            <w:tcW w:type="dxa" w:w="3120"/>
-            <w:shd w:fill="F6F9F7"/>
-            <w:tcMar>
-              <w:top w:w="80" w:type="dxa"/>
-              <w:bottom w:w="80" w:type="dxa"/>
-              <w:left w:w="100" w:type="dxa"/>
-              <w:right w:w="100" w:type="dxa"/>
-            </w:tcMar>
-          </w:tcPr>
-          <w:p>
-            <w:r>
-              <w:t>Compiles all audit scopes and qualitative answers into printable assurance layout.</w:t>
-            </w:r>
-          </w:p>
-        </w:tc>
-      </w:tr>
-    </w:tbl>
-    <w:p>
-      <w:pPr>
-        <w:pStyle w:val="Heading1"/>
-      </w:pPr>
-      <w:r>
-        <w:t>2. Tooltip Dictionary (14 Core Fields)</w:t>
-      </w:r>
-    </w:p>
-    <w:p>
-      <w:r>
-        <w:t xml:space="preserve">Hovering over the </w:t>
-      </w:r>
-      <w:r>
-        <w:rPr>
-          <w:rFonts w:ascii="Consolas" w:hAnsi="Consolas"/>
-          <w:color w:val="C0392B"/>
-          <w:sz w:val="19"/>
-        </w:rPr>
-        <w:t>[?]</w:t>
-      </w:r>
-      <w:r>
-        <w:t xml:space="preserve"> icons on fields displays the following definitions:</w:t>
-      </w:r>
-    </w:p>
-    <w:p>
-      <w:pPr>
-        <w:pStyle w:val="ListBullet"/>
-      </w:pPr>
-      <w:r/>
-      <w:r>
-        <w:rPr>
-          <w:b/>
-        </w:rPr>
-        <w:t>Company Name (Setup &amp; Calculator):</w:t>
-      </w:r>
-      <w:r>
-        <w:t xml:space="preserve"> "Specify the primary operating legal entity name as registered for carbon reporting."</w:t>
-      </w:r>
-    </w:p>
-    <w:p>
-      <w:pPr>
-        <w:pStyle w:val="ListBullet"/>
-      </w:pPr>
-      <w:r>
-        <w:t xml:space="preserve"> </w:t>
-      </w:r>
-      <w:r>
-        <w:rPr>
-          <w:b/>
-        </w:rPr>
-        <w:t>Scope Boundaries:</w:t>
-      </w:r>
-      <w:r>
-        <w:t xml:space="preserve"> "Check Scopes to define your operational control boundary (Scope 1=Direct, Scope 2=Grid, Scope 3=Value Chain)."</w:t>
-      </w:r>
-    </w:p>
-    <w:p>
-      <w:pPr>
-        <w:pStyle w:val="ListBullet"/>
-      </w:pPr>
-      <w:r>
-        <w:t xml:space="preserve"> </w:t>
-      </w:r>
-      <w:r>
-        <w:rPr>
-          <w:b/>
-        </w:rPr>
-        <w:t>Subsidiaries &amp; Joint Ventures:</w:t>
-      </w:r>
-      <w:r>
-        <w:t xml:space="preserve"> "Check JVs to apply financial control boundaries to subsidiary operations."</w:t>
-      </w:r>
-    </w:p>
-    <w:p>
-      <w:pPr>
-        <w:pStyle w:val="ListBullet"/>
-      </w:pPr>
-      <w:r>
-        <w:t xml:space="preserve"> </w:t>
-      </w:r>
-      <w:r>
-        <w:rPr>
-          <w:b/>
-        </w:rPr>
-        <w:t>Data Readiness Scale:</w:t>
-      </w:r>
-      <w:r>
-        <w:t xml:space="preserve"> "Select Level 1 for basic spreadsheets, or up to Level 5 for real-time automated API integration."</w:t>
-      </w:r>
-    </w:p>
-    <w:p>
-      <w:pPr>
-        <w:pStyle w:val="ListBullet"/>
-      </w:pPr>
-      <w:r>
-        <w:t xml:space="preserve"> </w:t>
-      </w:r>
-      <w:r>
-        <w:rPr>
-          <w:b/>
-        </w:rPr>
-        <w:t>Assurance Scope:</w:t>
-      </w:r>
-      <w:r>
-        <w:t xml:space="preserve"> "Target level of verification required: Limited (sample-based check) or Reasonable (deep audit check)."</w:t>
-      </w:r>
-    </w:p>
-    <w:p>
-      <w:pPr>
-        <w:pStyle w:val="ListBullet"/>
-      </w:pPr>
-      <w:r>
-        <w:t xml:space="preserve"> </w:t>
-      </w:r>
-      <w:r>
-        <w:rPr>
-          <w:b/>
-        </w:rPr>
-        <w:t>Region standard selector:</w:t>
-      </w:r>
-      <w:r>
-        <w:t xml:space="preserve"> "Select Region Standard (UK DEFRA, US EPA, EU AIB) to load correct emission factor coefficients."</w:t>
-      </w:r>
-    </w:p>
-    <w:p>
-      <w:pPr>
-        <w:pStyle w:val="ListBullet"/>
-      </w:pPr>
-      <w:r>
-        <w:t xml:space="preserve"> </w:t>
-      </w:r>
-      <w:r>
-        <w:rPr>
-          <w:b/>
-        </w:rPr>
-        <w:t>Fuel Gas (Scope 1):</w:t>
-      </w:r>
-      <w:r>
-        <w:t xml:space="preserve"> "Natural gas consumed by central heating systems or industrial boilers (kWh)."</w:t>
-      </w:r>
-    </w:p>
-    <w:p>
-      <w:pPr>
-        <w:pStyle w:val="ListBullet"/>
-      </w:pPr>
-      <w:r>
-        <w:t xml:space="preserve"> </w:t>
-      </w:r>
-      <w:r>
-        <w:rPr>
-          <w:b/>
-        </w:rPr>
-        <w:t>Fleet Diesel (Scope 1):</w:t>
-      </w:r>
-      <w:r>
-        <w:t xml:space="preserve"> "Total diesel consumed by company-owned or leased delivery vans and company cars (Litres)."</w:t>
-      </w:r>
-    </w:p>
-    <w:p>
-      <w:pPr>
-        <w:pStyle w:val="ListBullet"/>
-      </w:pPr>
-      <w:r>
-        <w:t xml:space="preserve"> </w:t>
-      </w:r>
-      <w:r>
-        <w:rPr>
-          <w:b/>
-        </w:rPr>
-        <w:t>Fleet Petrol (Scope 1):</w:t>
-      </w:r>
-      <w:r>
-        <w:t xml:space="preserve"> "Total petrol fuel consumed by sales fleet and corporate passenger vehicles (Litres)."</w:t>
-      </w:r>
-    </w:p>
-    <w:p>
-      <w:pPr>
-        <w:pStyle w:val="ListBullet"/>
-      </w:pPr>
-      <w:r/>
-      <w:r>
-        <w:rPr>
-          <w:b/>
-        </w:rPr>
-        <w:t>Refrigerant F-Gas (Scope 1):</w:t>
-      </w:r>
-      <w:r>
-        <w:t xml:space="preserve"> "Chemical top-ups for HVAC, chiller systems, and warehouse cold-storage cooling units (kg)."</w:t>
-      </w:r>
-    </w:p>
-    <w:p>
-      <w:pPr>
-        <w:pStyle w:val="ListBullet"/>
-      </w:pPr>
-      <w:r/>
-      <w:r>
-        <w:rPr>
-          <w:b/>
-        </w:rPr>
-        <w:t>Grid Electricity (Scope 2):</w:t>
-      </w:r>
-      <w:r>
-        <w:t xml:space="preserve"> "Grid electricity purchased for corporate offices and production plants (kWh)."</w:t>
-      </w:r>
-    </w:p>
-    <w:p>
-      <w:pPr>
-        <w:pStyle w:val="ListBullet"/>
-      </w:pPr>
-      <w:r/>
-      <w:r>
-        <w:rPr>
-          <w:b/>
-        </w:rPr>
-        <w:t>Business Travel (Scope 3):</w:t>
-      </w:r>
-      <w:r>
-        <w:t xml:space="preserve"> "Employee commuting miles and corporate flights/rail travel (passenger-km)."</w:t>
-      </w:r>
-    </w:p>
-    <w:p>
-      <w:pPr>
-        <w:pStyle w:val="ListBullet"/>
-      </w:pPr>
-      <w:r/>
-      <w:r>
-        <w:rPr>
-          <w:b/>
-        </w:rPr>
-        <w:t>Waste &amp; Water (Scope 3):</w:t>
-      </w:r>
-      <w:r>
-        <w:t xml:space="preserve"> "Solid waste sent to municipal disposal landfills (tonnes) and clean water withdrawn (m³)."</w:t>
-      </w:r>
-    </w:p>
-    <w:p>
-      <w:pPr>
-        <w:pStyle w:val="ListBullet"/>
-      </w:pPr>
-      <w:r/>
-      <w:r>
-        <w:rPr>
-          <w:b/>
-        </w:rPr>
-        <w:t>BIA Checklist (B-Corp):</w:t>
-      </w:r>
-      <w:r>
-        <w:t xml:space="preserve"> "Check off criteria items from the BIA framework to calculate your estimated certification entry score."</w:t>
-      </w:r>
-    </w:p>
-    <w:p>
-      <w:pPr>
-        <w:pStyle w:val="Heading1"/>
-      </w:pPr>
-      <w:r>
-        <w:t>3. Regional Emission Coefficients &amp; Price Rates</w:t>
-      </w:r>
-    </w:p>
-    <w:p>
-      <w:r>
-        <w:t>The Calculator automatically swaps these values depending on the selected Region:</w:t>
-      </w:r>
-    </w:p>
-    <w:p>
-      <w:pPr>
-        <w:pStyle w:val="Heading2"/>
-      </w:pPr>
-      <w:r>
-        <w:t>Carbon Emission Mappings (tCO2e per unit)</w:t>
-      </w:r>
-    </w:p>
-    <w:tbl>
-      <w:tblPr>
-        <w:tblW w:type="auto" w:w="0"/>
-        <w:jc w:val="center"/>
-        <w:tblLook w:firstColumn="1" w:firstRow="1" w:lastColumn="0" w:lastRow="0" w:noHBand="0" w:noVBand="1" w:val="04A0"/>
-        <w:tblBorders>
-          <w:top w:val="single" w:sz="4" w:space="0" w:color="D6EDDF"/>
-          <w:left w:val="single" w:sz="4" w:space="0" w:color="D6EDDF"/>
-          <w:bottom w:val="single" w:sz="4" w:space="0" w:color="D6EDDF"/>
-          <w:right w:val="single" w:sz="4" w:space="0" w:color="D6EDDF"/>
-          <w:insideH w:val="single" w:sz="4" w:space="0" w:color="D6EDDF"/>
-          <w:insideV w:val="single" w:sz="4" w:space="0" w:color="D6EDDF"/>
-        </w:tblBorders>
-      </w:tblPr>
-      <w:tblGrid>
-        <w:gridCol w:w="2340"/>
-        <w:gridCol w:w="2340"/>
-        <w:gridCol w:w="2340"/>
-        <w:gridCol w:w="2340"/>
-      </w:tblGrid>
-      <w:tr>
-        <w:tc>
-          <w:tcPr>
-            <w:tcW w:type="dxa" w:w="2340"/>
-            <w:shd w:fill="0F2318"/>
-            <w:tcMar>
-              <w:top w:w="80" w:type="dxa"/>
-              <w:bottom w:w="80" w:type="dxa"/>
-              <w:left w:w="100" w:type="dxa"/>
-              <w:right w:w="100" w:type="dxa"/>
-            </w:tcMar>
+            <w:tcW w:type="dxa" w:w="4986"/>
+            <w:shd w:val="clear" w:color="auto" w:fill="F6F9F7"/>
           </w:tcPr>
           <w:p>
             <w:r>
               <w:rPr>
-                <w:b/>
-                <w:color w:val="FFFFFF"/>
+                <w:sz w:val="18"/>
               </w:rPr>
-              <w:t>Factor ID</w:t>
+              <w:t>Step 7</w:t>
             </w:r>
           </w:p>
         </w:tc>
         <w:tc>
           <w:tcPr>
-            <w:tcW w:type="dxa" w:w="2340"/>
-            <w:shd w:fill="0F2318"/>
-            <w:tcMar>
-              <w:top w:w="80" w:type="dxa"/>
-              <w:bottom w:w="80" w:type="dxa"/>
-              <w:left w:w="100" w:type="dxa"/>
-              <w:right w:w="100" w:type="dxa"/>
-            </w:tcMar>
+            <w:tcW w:type="dxa" w:w="4986"/>
+            <w:shd w:val="clear" w:color="auto" w:fill="F6F9F7"/>
           </w:tcPr>
           <w:p>
             <w:r>
               <w:rPr>
-                <w:b/>
-                <w:color w:val="FFFFFF"/>
+                <w:sz w:val="18"/>
               </w:rPr>
-              <w:t>UK Standard (DEFRA)</w:t>
-            </w:r>
-          </w:p>
-        </w:tc>
-        <w:tc>
-          <w:tcPr>
-            <w:tcW w:type="dxa" w:w="2340"/>
-            <w:shd w:fill="0F2318"/>
-            <w:tcMar>
-              <w:top w:w="80" w:type="dxa"/>
-              <w:bottom w:w="80" w:type="dxa"/>
-              <w:left w:w="100" w:type="dxa"/>
-              <w:right w:w="100" w:type="dxa"/>
-            </w:tcMar>
-          </w:tcPr>
-          <w:p>
-            <w:r>
-              <w:rPr>
-                <w:b/>
-                <w:color w:val="FFFFFF"/>
-              </w:rPr>
-              <w:t>US Standard (EPA)</w:t>
-            </w:r>
-          </w:p>
-        </w:tc>
-        <w:tc>
-          <w:tcPr>
-            <w:tcW w:type="dxa" w:w="2340"/>
-            <w:shd w:fill="0F2318"/>
-            <w:tcMar>
-              <w:top w:w="80" w:type="dxa"/>
-              <w:bottom w:w="80" w:type="dxa"/>
-              <w:left w:w="100" w:type="dxa"/>
-              <w:right w:w="100" w:type="dxa"/>
-            </w:tcMar>
-          </w:tcPr>
-          <w:p>
-            <w:r>
-              <w:rPr>
-                <w:b/>
-                <w:color w:val="FFFFFF"/>
-              </w:rPr>
-              <w:t>EU Standard (AIB)</w:t>
+              <w:t>Review results — scores, charts, actions, frameworks, AI content</w:t>
             </w:r>
           </w:p>
         </w:tc>
@@ -969,800 +297,87 @@
       <w:tr>
         <w:tc>
           <w:tcPr>
-            <w:tcW w:type="dxa" w:w="2340"/>
-            <w:shd w:fill="F6F9F7"/>
-            <w:tcMar>
-              <w:top w:w="80" w:type="dxa"/>
-              <w:bottom w:w="80" w:type="dxa"/>
-              <w:left w:w="100" w:type="dxa"/>
-              <w:right w:w="100" w:type="dxa"/>
-            </w:tcMar>
+            <w:tcW w:type="dxa" w:w="4986"/>
+            <w:shd w:val="clear" w:color="auto" w:fill="FFFFFF"/>
           </w:tcPr>
           <w:p>
-            <w:r/>
             <w:r>
               <w:rPr>
-                <w:b/>
+                <w:sz w:val="18"/>
               </w:rPr>
-              <w:t>Natural Gas</w:t>
-            </w:r>
-            <w:r>
-              <w:t xml:space="preserve"> (per kWh)</w:t>
+              <w:t>Step 8</w:t>
             </w:r>
           </w:p>
         </w:tc>
         <w:tc>
           <w:tcPr>
-            <w:tcW w:type="dxa" w:w="2340"/>
-            <w:shd w:fill="F6F9F7"/>
-            <w:tcMar>
-              <w:top w:w="80" w:type="dxa"/>
-              <w:bottom w:w="80" w:type="dxa"/>
-              <w:left w:w="100" w:type="dxa"/>
-              <w:right w:w="100" w:type="dxa"/>
-            </w:tcMar>
+            <w:tcW w:type="dxa" w:w="4986"/>
+            <w:shd w:val="clear" w:color="auto" w:fill="FFFFFF"/>
           </w:tcPr>
           <w:p>
-            <w:r/>
             <w:r>
               <w:rPr>
-                <w:rFonts w:ascii="Consolas" w:hAnsi="Consolas"/>
-                <w:color w:val="C0392B"/>
-                <w:sz w:val="17"/>
+                <w:sz w:val="18"/>
               </w:rPr>
-              <w:t>0.18293</w:t>
+              <w:t>Export PDF and/or Download Backup</w:t>
             </w:r>
-            <w:r/>
-          </w:p>
-        </w:tc>
-        <w:tc>
-          <w:tcPr>
-            <w:tcW w:type="dxa" w:w="2340"/>
-            <w:shd w:fill="F6F9F7"/>
-            <w:tcMar>
-              <w:top w:w="80" w:type="dxa"/>
-              <w:bottom w:w="80" w:type="dxa"/>
-              <w:left w:w="100" w:type="dxa"/>
-              <w:right w:w="100" w:type="dxa"/>
-            </w:tcMar>
-          </w:tcPr>
-          <w:p>
-            <w:r/>
-            <w:r>
-              <w:rPr>
-                <w:rFonts w:ascii="Consolas" w:hAnsi="Consolas"/>
-                <w:color w:val="C0392B"/>
-                <w:sz w:val="17"/>
-              </w:rPr>
-              <w:t>0.18120</w:t>
-            </w:r>
-            <w:r/>
-          </w:p>
-        </w:tc>
-        <w:tc>
-          <w:tcPr>
-            <w:tcW w:type="dxa" w:w="2340"/>
-            <w:shd w:fill="F6F9F7"/>
-            <w:tcMar>
-              <w:top w:w="80" w:type="dxa"/>
-              <w:bottom w:w="80" w:type="dxa"/>
-              <w:left w:w="100" w:type="dxa"/>
-              <w:right w:w="100" w:type="dxa"/>
-            </w:tcMar>
-          </w:tcPr>
-          <w:p>
-            <w:r/>
-            <w:r>
-              <w:rPr>
-                <w:rFonts w:ascii="Consolas" w:hAnsi="Consolas"/>
-                <w:color w:val="C0392B"/>
-                <w:sz w:val="17"/>
-              </w:rPr>
-              <w:t>0.20100</w:t>
-            </w:r>
-            <w:r/>
-          </w:p>
-        </w:tc>
-      </w:tr>
-      <w:tr>
-        <w:tc>
-          <w:tcPr>
-            <w:tcW w:type="dxa" w:w="2340"/>
-            <w:shd w:fill="FFFFFF"/>
-            <w:tcMar>
-              <w:top w:w="80" w:type="dxa"/>
-              <w:bottom w:w="80" w:type="dxa"/>
-              <w:left w:w="100" w:type="dxa"/>
-              <w:right w:w="100" w:type="dxa"/>
-            </w:tcMar>
-          </w:tcPr>
-          <w:p>
-            <w:r/>
-            <w:r>
-              <w:rPr>
-                <w:b/>
-              </w:rPr>
-              <w:t>Diesel Fuel</w:t>
-            </w:r>
-            <w:r>
-              <w:t xml:space="preserve"> (per Litre)</w:t>
-            </w:r>
-          </w:p>
-        </w:tc>
-        <w:tc>
-          <w:tcPr>
-            <w:tcW w:type="dxa" w:w="2340"/>
-            <w:shd w:fill="FFFFFF"/>
-            <w:tcMar>
-              <w:top w:w="80" w:type="dxa"/>
-              <w:bottom w:w="80" w:type="dxa"/>
-              <w:left w:w="100" w:type="dxa"/>
-              <w:right w:w="100" w:type="dxa"/>
-            </w:tcMar>
-          </w:tcPr>
-          <w:p>
-            <w:r/>
-            <w:r>
-              <w:rPr>
-                <w:rFonts w:ascii="Consolas" w:hAnsi="Consolas"/>
-                <w:color w:val="C0392B"/>
-                <w:sz w:val="17"/>
-              </w:rPr>
-              <w:t>2.51233</w:t>
-            </w:r>
-            <w:r/>
-          </w:p>
-        </w:tc>
-        <w:tc>
-          <w:tcPr>
-            <w:tcW w:type="dxa" w:w="2340"/>
-            <w:shd w:fill="FFFFFF"/>
-            <w:tcMar>
-              <w:top w:w="80" w:type="dxa"/>
-              <w:bottom w:w="80" w:type="dxa"/>
-              <w:left w:w="100" w:type="dxa"/>
-              <w:right w:w="100" w:type="dxa"/>
-            </w:tcMar>
-          </w:tcPr>
-          <w:p>
-            <w:r/>
-            <w:r>
-              <w:rPr>
-                <w:rFonts w:ascii="Consolas" w:hAnsi="Consolas"/>
-                <w:color w:val="C0392B"/>
-                <w:sz w:val="17"/>
-              </w:rPr>
-              <w:t>2.68000</w:t>
-            </w:r>
-            <w:r/>
-          </w:p>
-        </w:tc>
-        <w:tc>
-          <w:tcPr>
-            <w:tcW w:type="dxa" w:w="2340"/>
-            <w:shd w:fill="FFFFFF"/>
-            <w:tcMar>
-              <w:top w:w="80" w:type="dxa"/>
-              <w:bottom w:w="80" w:type="dxa"/>
-              <w:left w:w="100" w:type="dxa"/>
-              <w:right w:w="100" w:type="dxa"/>
-            </w:tcMar>
-          </w:tcPr>
-          <w:p>
-            <w:r/>
-            <w:r>
-              <w:rPr>
-                <w:rFonts w:ascii="Consolas" w:hAnsi="Consolas"/>
-                <w:color w:val="C0392B"/>
-                <w:sz w:val="17"/>
-              </w:rPr>
-              <w:t>2.65000</w:t>
-            </w:r>
-            <w:r/>
-          </w:p>
-        </w:tc>
-      </w:tr>
-      <w:tr>
-        <w:tc>
-          <w:tcPr>
-            <w:tcW w:type="dxa" w:w="2340"/>
-            <w:shd w:fill="F6F9F7"/>
-            <w:tcMar>
-              <w:top w:w="80" w:type="dxa"/>
-              <w:bottom w:w="80" w:type="dxa"/>
-              <w:left w:w="100" w:type="dxa"/>
-              <w:right w:w="100" w:type="dxa"/>
-            </w:tcMar>
-          </w:tcPr>
-          <w:p>
-            <w:r/>
-            <w:r>
-              <w:rPr>
-                <w:b/>
-              </w:rPr>
-              <w:t>Petrol Fuel</w:t>
-            </w:r>
-            <w:r>
-              <w:t xml:space="preserve"> (per Litre)</w:t>
-            </w:r>
-          </w:p>
-        </w:tc>
-        <w:tc>
-          <w:tcPr>
-            <w:tcW w:type="dxa" w:w="2340"/>
-            <w:shd w:fill="F6F9F7"/>
-            <w:tcMar>
-              <w:top w:w="80" w:type="dxa"/>
-              <w:bottom w:w="80" w:type="dxa"/>
-              <w:left w:w="100" w:type="dxa"/>
-              <w:right w:w="100" w:type="dxa"/>
-            </w:tcMar>
-          </w:tcPr>
-          <w:p>
-            <w:r/>
-            <w:r>
-              <w:rPr>
-                <w:rFonts w:ascii="Consolas" w:hAnsi="Consolas"/>
-                <w:color w:val="C0392B"/>
-                <w:sz w:val="17"/>
-              </w:rPr>
-              <w:t>2.10444</w:t>
-            </w:r>
-            <w:r/>
-          </w:p>
-        </w:tc>
-        <w:tc>
-          <w:tcPr>
-            <w:tcW w:type="dxa" w:w="2340"/>
-            <w:shd w:fill="F6F9F7"/>
-            <w:tcMar>
-              <w:top w:w="80" w:type="dxa"/>
-              <w:bottom w:w="80" w:type="dxa"/>
-              <w:left w:w="100" w:type="dxa"/>
-              <w:right w:w="100" w:type="dxa"/>
-            </w:tcMar>
-          </w:tcPr>
-          <w:p>
-            <w:r/>
-            <w:r>
-              <w:rPr>
-                <w:rFonts w:ascii="Consolas" w:hAnsi="Consolas"/>
-                <w:color w:val="C0392B"/>
-                <w:sz w:val="17"/>
-              </w:rPr>
-              <w:t>2.31000</w:t>
-            </w:r>
-            <w:r/>
-          </w:p>
-        </w:tc>
-        <w:tc>
-          <w:tcPr>
-            <w:tcW w:type="dxa" w:w="2340"/>
-            <w:shd w:fill="F6F9F7"/>
-            <w:tcMar>
-              <w:top w:w="80" w:type="dxa"/>
-              <w:bottom w:w="80" w:type="dxa"/>
-              <w:left w:w="100" w:type="dxa"/>
-              <w:right w:w="100" w:type="dxa"/>
-            </w:tcMar>
-          </w:tcPr>
-          <w:p>
-            <w:r/>
-            <w:r>
-              <w:rPr>
-                <w:rFonts w:ascii="Consolas" w:hAnsi="Consolas"/>
-                <w:color w:val="C0392B"/>
-                <w:sz w:val="17"/>
-              </w:rPr>
-              <w:t>2.30000</w:t>
-            </w:r>
-            <w:r/>
-          </w:p>
-        </w:tc>
-      </w:tr>
-      <w:tr>
-        <w:tc>
-          <w:tcPr>
-            <w:tcW w:type="dxa" w:w="2340"/>
-            <w:shd w:fill="FFFFFF"/>
-            <w:tcMar>
-              <w:top w:w="80" w:type="dxa"/>
-              <w:bottom w:w="80" w:type="dxa"/>
-              <w:left w:w="100" w:type="dxa"/>
-              <w:right w:w="100" w:type="dxa"/>
-            </w:tcMar>
-          </w:tcPr>
-          <w:p>
-            <w:r/>
-            <w:r>
-              <w:rPr>
-                <w:b/>
-              </w:rPr>
-              <w:t>Refrigerants</w:t>
-            </w:r>
-            <w:r>
-              <w:t xml:space="preserve"> (per kg)</w:t>
-            </w:r>
-          </w:p>
-        </w:tc>
-        <w:tc>
-          <w:tcPr>
-            <w:tcW w:type="dxa" w:w="2340"/>
-            <w:shd w:fill="FFFFFF"/>
-            <w:tcMar>
-              <w:top w:w="80" w:type="dxa"/>
-              <w:bottom w:w="80" w:type="dxa"/>
-              <w:left w:w="100" w:type="dxa"/>
-              <w:right w:w="100" w:type="dxa"/>
-            </w:tcMar>
-          </w:tcPr>
-          <w:p>
-            <w:r/>
-            <w:r>
-              <w:rPr>
-                <w:rFonts w:ascii="Consolas" w:hAnsi="Consolas"/>
-                <w:color w:val="C0392B"/>
-                <w:sz w:val="17"/>
-              </w:rPr>
-              <w:t>2088.00</w:t>
-            </w:r>
-            <w:r/>
-          </w:p>
-        </w:tc>
-        <w:tc>
-          <w:tcPr>
-            <w:tcW w:type="dxa" w:w="2340"/>
-            <w:shd w:fill="FFFFFF"/>
-            <w:tcMar>
-              <w:top w:w="80" w:type="dxa"/>
-              <w:bottom w:w="80" w:type="dxa"/>
-              <w:left w:w="100" w:type="dxa"/>
-              <w:right w:w="100" w:type="dxa"/>
-            </w:tcMar>
-          </w:tcPr>
-          <w:p>
-            <w:r/>
-            <w:r>
-              <w:rPr>
-                <w:rFonts w:ascii="Consolas" w:hAnsi="Consolas"/>
-                <w:color w:val="C0392B"/>
-                <w:sz w:val="17"/>
-              </w:rPr>
-              <w:t>2088.00</w:t>
-            </w:r>
-            <w:r/>
-          </w:p>
-        </w:tc>
-        <w:tc>
-          <w:tcPr>
-            <w:tcW w:type="dxa" w:w="2340"/>
-            <w:shd w:fill="FFFFFF"/>
-            <w:tcMar>
-              <w:top w:w="80" w:type="dxa"/>
-              <w:bottom w:w="80" w:type="dxa"/>
-              <w:left w:w="100" w:type="dxa"/>
-              <w:right w:w="100" w:type="dxa"/>
-            </w:tcMar>
-          </w:tcPr>
-          <w:p>
-            <w:r/>
-            <w:r>
-              <w:rPr>
-                <w:rFonts w:ascii="Consolas" w:hAnsi="Consolas"/>
-                <w:color w:val="C0392B"/>
-                <w:sz w:val="17"/>
-              </w:rPr>
-              <w:t>2088.00</w:t>
-            </w:r>
-            <w:r/>
-          </w:p>
-        </w:tc>
-      </w:tr>
-      <w:tr>
-        <w:tc>
-          <w:tcPr>
-            <w:tcW w:type="dxa" w:w="2340"/>
-            <w:shd w:fill="F6F9F7"/>
-            <w:tcMar>
-              <w:top w:w="80" w:type="dxa"/>
-              <w:bottom w:w="80" w:type="dxa"/>
-              <w:left w:w="100" w:type="dxa"/>
-              <w:right w:w="100" w:type="dxa"/>
-            </w:tcMar>
-          </w:tcPr>
-          <w:p>
-            <w:r/>
-            <w:r>
-              <w:rPr>
-                <w:b/>
-              </w:rPr>
-              <w:t>Electricity</w:t>
-            </w:r>
-            <w:r>
-              <w:t xml:space="preserve"> (per kWh)</w:t>
-            </w:r>
-          </w:p>
-        </w:tc>
-        <w:tc>
-          <w:tcPr>
-            <w:tcW w:type="dxa" w:w="2340"/>
-            <w:shd w:fill="F6F9F7"/>
-            <w:tcMar>
-              <w:top w:w="80" w:type="dxa"/>
-              <w:bottom w:w="80" w:type="dxa"/>
-              <w:left w:w="100" w:type="dxa"/>
-              <w:right w:w="100" w:type="dxa"/>
-            </w:tcMar>
-          </w:tcPr>
-          <w:p>
-            <w:r/>
-            <w:r>
-              <w:rPr>
-                <w:rFonts w:ascii="Consolas" w:hAnsi="Consolas"/>
-                <w:color w:val="C0392B"/>
-                <w:sz w:val="17"/>
-              </w:rPr>
-              <w:t>0.20707</w:t>
-            </w:r>
-            <w:r/>
-          </w:p>
-        </w:tc>
-        <w:tc>
-          <w:tcPr>
-            <w:tcW w:type="dxa" w:w="2340"/>
-            <w:shd w:fill="F6F9F7"/>
-            <w:tcMar>
-              <w:top w:w="80" w:type="dxa"/>
-              <w:bottom w:w="80" w:type="dxa"/>
-              <w:left w:w="100" w:type="dxa"/>
-              <w:right w:w="100" w:type="dxa"/>
-            </w:tcMar>
-          </w:tcPr>
-          <w:p>
-            <w:r/>
-            <w:r>
-              <w:rPr>
-                <w:rFonts w:ascii="Consolas" w:hAnsi="Consolas"/>
-                <w:color w:val="C0392B"/>
-                <w:sz w:val="17"/>
-              </w:rPr>
-              <w:t>0.37100</w:t>
-            </w:r>
-            <w:r/>
-          </w:p>
-        </w:tc>
-        <w:tc>
-          <w:tcPr>
-            <w:tcW w:type="dxa" w:w="2340"/>
-            <w:shd w:fill="F6F9F7"/>
-            <w:tcMar>
-              <w:top w:w="80" w:type="dxa"/>
-              <w:bottom w:w="80" w:type="dxa"/>
-              <w:left w:w="100" w:type="dxa"/>
-              <w:right w:w="100" w:type="dxa"/>
-            </w:tcMar>
-          </w:tcPr>
-          <w:p>
-            <w:r/>
-            <w:r>
-              <w:rPr>
-                <w:rFonts w:ascii="Consolas" w:hAnsi="Consolas"/>
-                <w:color w:val="C0392B"/>
-                <w:sz w:val="17"/>
-              </w:rPr>
-              <w:t>0.27500</w:t>
-            </w:r>
-            <w:r/>
-          </w:p>
-        </w:tc>
-      </w:tr>
-      <w:tr>
-        <w:tc>
-          <w:tcPr>
-            <w:tcW w:type="dxa" w:w="2340"/>
-            <w:shd w:fill="FFFFFF"/>
-            <w:tcMar>
-              <w:top w:w="80" w:type="dxa"/>
-              <w:bottom w:w="80" w:type="dxa"/>
-              <w:left w:w="100" w:type="dxa"/>
-              <w:right w:w="100" w:type="dxa"/>
-            </w:tcMar>
-          </w:tcPr>
-          <w:p>
-            <w:r/>
-            <w:r>
-              <w:rPr>
-                <w:b/>
-              </w:rPr>
-              <w:t>Flight Travel</w:t>
-            </w:r>
-            <w:r>
-              <w:t xml:space="preserve"> (per pass-km)</w:t>
-            </w:r>
-          </w:p>
-        </w:tc>
-        <w:tc>
-          <w:tcPr>
-            <w:tcW w:type="dxa" w:w="2340"/>
-            <w:shd w:fill="FFFFFF"/>
-            <w:tcMar>
-              <w:top w:w="80" w:type="dxa"/>
-              <w:bottom w:w="80" w:type="dxa"/>
-              <w:left w:w="100" w:type="dxa"/>
-              <w:right w:w="100" w:type="dxa"/>
-            </w:tcMar>
-          </w:tcPr>
-          <w:p>
-            <w:r/>
-            <w:r>
-              <w:rPr>
-                <w:rFonts w:ascii="Consolas" w:hAnsi="Consolas"/>
-                <w:color w:val="C0392B"/>
-                <w:sz w:val="17"/>
-              </w:rPr>
-              <w:t>0.15600</w:t>
-            </w:r>
-            <w:r/>
-          </w:p>
-        </w:tc>
-        <w:tc>
-          <w:tcPr>
-            <w:tcW w:type="dxa" w:w="2340"/>
-            <w:shd w:fill="FFFFFF"/>
-            <w:tcMar>
-              <w:top w:w="80" w:type="dxa"/>
-              <w:bottom w:w="80" w:type="dxa"/>
-              <w:left w:w="100" w:type="dxa"/>
-              <w:right w:w="100" w:type="dxa"/>
-            </w:tcMar>
-          </w:tcPr>
-          <w:p>
-            <w:r/>
-            <w:r>
-              <w:rPr>
-                <w:rFonts w:ascii="Consolas" w:hAnsi="Consolas"/>
-                <w:color w:val="C0392B"/>
-                <w:sz w:val="17"/>
-              </w:rPr>
-              <w:t>0.13300</w:t>
-            </w:r>
-            <w:r/>
-          </w:p>
-        </w:tc>
-        <w:tc>
-          <w:tcPr>
-            <w:tcW w:type="dxa" w:w="2340"/>
-            <w:shd w:fill="FFFFFF"/>
-            <w:tcMar>
-              <w:top w:w="80" w:type="dxa"/>
-              <w:bottom w:w="80" w:type="dxa"/>
-              <w:left w:w="100" w:type="dxa"/>
-              <w:right w:w="100" w:type="dxa"/>
-            </w:tcMar>
-          </w:tcPr>
-          <w:p>
-            <w:r/>
-            <w:r>
-              <w:rPr>
-                <w:rFonts w:ascii="Consolas" w:hAnsi="Consolas"/>
-                <w:color w:val="C0392B"/>
-                <w:sz w:val="17"/>
-              </w:rPr>
-              <w:t>0.14500</w:t>
-            </w:r>
-            <w:r/>
-          </w:p>
-        </w:tc>
-      </w:tr>
-      <w:tr>
-        <w:tc>
-          <w:tcPr>
-            <w:tcW w:type="dxa" w:w="2340"/>
-            <w:shd w:fill="F6F9F7"/>
-            <w:tcMar>
-              <w:top w:w="80" w:type="dxa"/>
-              <w:bottom w:w="80" w:type="dxa"/>
-              <w:left w:w="100" w:type="dxa"/>
-              <w:right w:w="100" w:type="dxa"/>
-            </w:tcMar>
-          </w:tcPr>
-          <w:p>
-            <w:r/>
-            <w:r>
-              <w:rPr>
-                <w:b/>
-              </w:rPr>
-              <w:t>Solid Waste</w:t>
-            </w:r>
-            <w:r>
-              <w:t xml:space="preserve"> (per Tonne)</w:t>
-            </w:r>
-          </w:p>
-        </w:tc>
-        <w:tc>
-          <w:tcPr>
-            <w:tcW w:type="dxa" w:w="2340"/>
-            <w:shd w:fill="F6F9F7"/>
-            <w:tcMar>
-              <w:top w:w="80" w:type="dxa"/>
-              <w:bottom w:w="80" w:type="dxa"/>
-              <w:left w:w="100" w:type="dxa"/>
-              <w:right w:w="100" w:type="dxa"/>
-            </w:tcMar>
-          </w:tcPr>
-          <w:p>
-            <w:r/>
-            <w:r>
-              <w:rPr>
-                <w:rFonts w:ascii="Consolas" w:hAnsi="Consolas"/>
-                <w:color w:val="C0392B"/>
-                <w:sz w:val="17"/>
-              </w:rPr>
-              <w:t>467.000</w:t>
-            </w:r>
-            <w:r/>
-          </w:p>
-        </w:tc>
-        <w:tc>
-          <w:tcPr>
-            <w:tcW w:type="dxa" w:w="2340"/>
-            <w:shd w:fill="F6F9F7"/>
-            <w:tcMar>
-              <w:top w:w="80" w:type="dxa"/>
-              <w:bottom w:w="80" w:type="dxa"/>
-              <w:left w:w="100" w:type="dxa"/>
-              <w:right w:w="100" w:type="dxa"/>
-            </w:tcMar>
-          </w:tcPr>
-          <w:p>
-            <w:r/>
-            <w:r>
-              <w:rPr>
-                <w:rFonts w:ascii="Consolas" w:hAnsi="Consolas"/>
-                <w:color w:val="C0392B"/>
-                <w:sz w:val="17"/>
-              </w:rPr>
-              <w:t>467.000</w:t>
-            </w:r>
-            <w:r/>
-          </w:p>
-        </w:tc>
-        <w:tc>
-          <w:tcPr>
-            <w:tcW w:type="dxa" w:w="2340"/>
-            <w:shd w:fill="F6F9F7"/>
-            <w:tcMar>
-              <w:top w:w="80" w:type="dxa"/>
-              <w:bottom w:w="80" w:type="dxa"/>
-              <w:left w:w="100" w:type="dxa"/>
-              <w:right w:w="100" w:type="dxa"/>
-            </w:tcMar>
-          </w:tcPr>
-          <w:p>
-            <w:r/>
-            <w:r>
-              <w:rPr>
-                <w:rFonts w:ascii="Consolas" w:hAnsi="Consolas"/>
-                <w:color w:val="C0392B"/>
-                <w:sz w:val="17"/>
-              </w:rPr>
-              <w:t>467.000</w:t>
-            </w:r>
-            <w:r/>
           </w:p>
         </w:tc>
       </w:tr>
     </w:tbl>
+    <w:p/>
     <w:p>
       <w:pPr>
-        <w:pStyle w:val="Heading2"/>
+        <w:pStyle w:val="Heading1"/>
+        <w:spacing w:before="280" w:after="80"/>
       </w:pPr>
       <w:r>
-        <w:t>Utility Price Rates (Price per unit)</w:t>
+        <w:rPr>
+          <w:color w:val="1A6B3C"/>
+        </w:rPr>
+        <w:t>Results Screen — Buttons</w:t>
       </w:r>
     </w:p>
     <w:tbl>
       <w:tblPr>
+        <w:tblStyle w:val="TableGrid"/>
         <w:tblW w:type="auto" w:w="0"/>
-        <w:jc w:val="center"/>
         <w:tblLook w:firstColumn="1" w:firstRow="1" w:lastColumn="0" w:lastRow="0" w:noHBand="0" w:noVBand="1" w:val="04A0"/>
-        <w:tblBorders>
-          <w:top w:val="single" w:sz="4" w:space="0" w:color="D6EDDF"/>
-          <w:left w:val="single" w:sz="4" w:space="0" w:color="D6EDDF"/>
-          <w:bottom w:val="single" w:sz="4" w:space="0" w:color="D6EDDF"/>
-          <w:right w:val="single" w:sz="4" w:space="0" w:color="D6EDDF"/>
-          <w:insideH w:val="single" w:sz="4" w:space="0" w:color="D6EDDF"/>
-          <w:insideV w:val="single" w:sz="4" w:space="0" w:color="D6EDDF"/>
-        </w:tblBorders>
       </w:tblPr>
       <w:tblGrid>
-        <w:gridCol w:w="2340"/>
-        <w:gridCol w:w="2340"/>
-        <w:gridCol w:w="2340"/>
-        <w:gridCol w:w="2340"/>
+        <w:gridCol w:w="4986"/>
+        <w:gridCol w:w="4986"/>
       </w:tblGrid>
       <w:tr>
         <w:tc>
           <w:tcPr>
-            <w:tcW w:type="dxa" w:w="2340"/>
-            <w:shd w:fill="0F2318"/>
-            <w:tcMar>
-              <w:top w:w="80" w:type="dxa"/>
-              <w:bottom w:w="80" w:type="dxa"/>
-              <w:left w:w="100" w:type="dxa"/>
-              <w:right w:w="100" w:type="dxa"/>
-            </w:tcMar>
+            <w:tcW w:type="dxa" w:w="4986"/>
+            <w:shd w:val="clear" w:color="auto" w:fill="1A6B3C"/>
           </w:tcPr>
           <w:p>
             <w:r>
               <w:rPr>
                 <w:b/>
                 <w:color w:val="FFFFFF"/>
+                <w:sz w:val="18"/>
               </w:rPr>
-              <w:t>Region</w:t>
+              <w:t>Button</w:t>
             </w:r>
           </w:p>
         </w:tc>
         <w:tc>
           <w:tcPr>
-            <w:tcW w:type="dxa" w:w="2340"/>
-            <w:shd w:fill="0F2318"/>
-            <w:tcMar>
-              <w:top w:w="80" w:type="dxa"/>
-              <w:bottom w:w="80" w:type="dxa"/>
-              <w:left w:w="100" w:type="dxa"/>
-              <w:right w:w="100" w:type="dxa"/>
-            </w:tcMar>
+            <w:tcW w:type="dxa" w:w="4986"/>
+            <w:shd w:val="clear" w:color="auto" w:fill="1A6B3C"/>
           </w:tcPr>
           <w:p>
             <w:r>
               <w:rPr>
                 <w:b/>
                 <w:color w:val="FFFFFF"/>
+                <w:sz w:val="18"/>
               </w:rPr>
-              <w:t>Electricity Price (per kWh)</w:t>
-            </w:r>
-          </w:p>
-        </w:tc>
-        <w:tc>
-          <w:tcPr>
-            <w:tcW w:type="dxa" w:w="2340"/>
-            <w:shd w:fill="0F2318"/>
-            <w:tcMar>
-              <w:top w:w="80" w:type="dxa"/>
-              <w:bottom w:w="80" w:type="dxa"/>
-              <w:left w:w="100" w:type="dxa"/>
-              <w:right w:w="100" w:type="dxa"/>
-            </w:tcMar>
-          </w:tcPr>
-          <w:p>
-            <w:r>
-              <w:rPr>
-                <w:b/>
-                <w:color w:val="FFFFFF"/>
-              </w:rPr>
-              <w:t>Gas Price (per kWh)</w:t>
-            </w:r>
-          </w:p>
-        </w:tc>
-        <w:tc>
-          <w:tcPr>
-            <w:tcW w:type="dxa" w:w="2340"/>
-            <w:shd w:fill="0F2318"/>
-            <w:tcMar>
-              <w:top w:w="80" w:type="dxa"/>
-              <w:bottom w:w="80" w:type="dxa"/>
-              <w:left w:w="100" w:type="dxa"/>
-              <w:right w:w="100" w:type="dxa"/>
-            </w:tcMar>
-          </w:tcPr>
-          <w:p>
-            <w:r>
-              <w:rPr>
-                <w:b/>
-                <w:color w:val="FFFFFF"/>
-              </w:rPr>
-              <w:t>Currency Symbol</w:t>
+              <w:t>Purpose</w:t>
             </w:r>
           </w:p>
         </w:tc>
@@ -1770,513 +385,1665 @@
       <w:tr>
         <w:tc>
           <w:tcPr>
-            <w:tcW w:type="dxa" w:w="2340"/>
-            <w:shd w:fill="F6F9F7"/>
-            <w:tcMar>
-              <w:top w:w="80" w:type="dxa"/>
-              <w:bottom w:w="80" w:type="dxa"/>
-              <w:left w:w="100" w:type="dxa"/>
-              <w:right w:w="100" w:type="dxa"/>
-            </w:tcMar>
+            <w:tcW w:type="dxa" w:w="4986"/>
+            <w:shd w:val="clear" w:color="auto" w:fill="F6F9F7"/>
           </w:tcPr>
           <w:p>
-            <w:r/>
             <w:r>
               <w:rPr>
-                <w:b/>
+                <w:sz w:val="18"/>
               </w:rPr>
-              <w:t>UK (DEFRA)</w:t>
+              <w:t>⬇ Export PDF</w:t>
             </w:r>
-            <w:r/>
           </w:p>
         </w:tc>
         <w:tc>
           <w:tcPr>
-            <w:tcW w:type="dxa" w:w="2340"/>
-            <w:shd w:fill="F6F9F7"/>
-            <w:tcMar>
-              <w:top w:w="80" w:type="dxa"/>
-              <w:bottom w:w="80" w:type="dxa"/>
-              <w:left w:w="100" w:type="dxa"/>
-              <w:right w:w="100" w:type="dxa"/>
-            </w:tcMar>
+            <w:tcW w:type="dxa" w:w="4986"/>
+            <w:shd w:val="clear" w:color="auto" w:fill="F6F9F7"/>
           </w:tcPr>
           <w:p>
-            <w:r/>
             <w:r>
               <w:rPr>
-                <w:rFonts w:ascii="Consolas" w:hAnsi="Consolas"/>
-                <w:color w:val="C0392B"/>
-                <w:sz w:val="17"/>
+                <w:sz w:val="18"/>
               </w:rPr>
-              <w:t>£0.28</w:t>
+              <w:t>Full PDF report (reflects AI on/off status)</w:t>
             </w:r>
-            <w:r/>
-          </w:p>
-        </w:tc>
-        <w:tc>
-          <w:tcPr>
-            <w:tcW w:type="dxa" w:w="2340"/>
-            <w:shd w:fill="F6F9F7"/>
-            <w:tcMar>
-              <w:top w:w="80" w:type="dxa"/>
-              <w:bottom w:w="80" w:type="dxa"/>
-              <w:left w:w="100" w:type="dxa"/>
-              <w:right w:w="100" w:type="dxa"/>
-            </w:tcMar>
-          </w:tcPr>
-          <w:p>
-            <w:r/>
-            <w:r>
-              <w:rPr>
-                <w:rFonts w:ascii="Consolas" w:hAnsi="Consolas"/>
-                <w:color w:val="C0392B"/>
-                <w:sz w:val="17"/>
-              </w:rPr>
-              <w:t>£0.07</w:t>
-            </w:r>
-            <w:r/>
-          </w:p>
-        </w:tc>
-        <w:tc>
-          <w:tcPr>
-            <w:tcW w:type="dxa" w:w="2340"/>
-            <w:shd w:fill="F6F9F7"/>
-            <w:tcMar>
-              <w:top w:w="80" w:type="dxa"/>
-              <w:bottom w:w="80" w:type="dxa"/>
-              <w:left w:w="100" w:type="dxa"/>
-              <w:right w:w="100" w:type="dxa"/>
-            </w:tcMar>
-          </w:tcPr>
-          <w:p>
-            <w:r/>
-            <w:r>
-              <w:rPr>
-                <w:rFonts w:ascii="Consolas" w:hAnsi="Consolas"/>
-                <w:color w:val="C0392B"/>
-                <w:sz w:val="17"/>
-              </w:rPr>
-              <w:t>£</w:t>
-            </w:r>
-            <w:r/>
           </w:p>
         </w:tc>
       </w:tr>
       <w:tr>
         <w:tc>
           <w:tcPr>
-            <w:tcW w:type="dxa" w:w="2340"/>
-            <w:shd w:fill="FFFFFF"/>
-            <w:tcMar>
-              <w:top w:w="80" w:type="dxa"/>
-              <w:bottom w:w="80" w:type="dxa"/>
-              <w:left w:w="100" w:type="dxa"/>
-              <w:right w:w="100" w:type="dxa"/>
-            </w:tcMar>
+            <w:tcW w:type="dxa" w:w="4986"/>
+            <w:shd w:val="clear" w:color="auto" w:fill="FFFFFF"/>
           </w:tcPr>
           <w:p>
-            <w:r/>
             <w:r>
               <w:rPr>
-                <w:b/>
+                <w:sz w:val="18"/>
               </w:rPr>
-              <w:t>US (EPA)</w:t>
+              <w:t>💾 Download Backup</w:t>
             </w:r>
-            <w:r/>
           </w:p>
         </w:tc>
         <w:tc>
           <w:tcPr>
-            <w:tcW w:type="dxa" w:w="2340"/>
-            <w:shd w:fill="FFFFFF"/>
-            <w:tcMar>
-              <w:top w:w="80" w:type="dxa"/>
-              <w:bottom w:w="80" w:type="dxa"/>
-              <w:left w:w="100" w:type="dxa"/>
-              <w:right w:w="100" w:type="dxa"/>
-            </w:tcMar>
+            <w:tcW w:type="dxa" w:w="4986"/>
+            <w:shd w:val="clear" w:color="auto" w:fill="FFFFFF"/>
           </w:tcPr>
           <w:p>
-            <w:r/>
             <w:r>
               <w:rPr>
-                <w:rFonts w:ascii="Consolas" w:hAnsi="Consolas"/>
-                <w:color w:val="C0392B"/>
-                <w:sz w:val="17"/>
+                <w:sz w:val="18"/>
               </w:rPr>
-              <w:t>$0.16</w:t>
+              <w:t>Save all answers as JSON for later restore</w:t>
             </w:r>
-            <w:r/>
-          </w:p>
-        </w:tc>
-        <w:tc>
-          <w:tcPr>
-            <w:tcW w:type="dxa" w:w="2340"/>
-            <w:shd w:fill="FFFFFF"/>
-            <w:tcMar>
-              <w:top w:w="80" w:type="dxa"/>
-              <w:bottom w:w="80" w:type="dxa"/>
-              <w:left w:w="100" w:type="dxa"/>
-              <w:right w:w="100" w:type="dxa"/>
-            </w:tcMar>
-          </w:tcPr>
-          <w:p>
-            <w:r/>
-            <w:r>
-              <w:rPr>
-                <w:rFonts w:ascii="Consolas" w:hAnsi="Consolas"/>
-                <w:color w:val="C0392B"/>
-                <w:sz w:val="17"/>
-              </w:rPr>
-              <w:t>$0.04</w:t>
-            </w:r>
-            <w:r/>
-          </w:p>
-        </w:tc>
-        <w:tc>
-          <w:tcPr>
-            <w:tcW w:type="dxa" w:w="2340"/>
-            <w:shd w:fill="FFFFFF"/>
-            <w:tcMar>
-              <w:top w:w="80" w:type="dxa"/>
-              <w:bottom w:w="80" w:type="dxa"/>
-              <w:left w:w="100" w:type="dxa"/>
-              <w:right w:w="100" w:type="dxa"/>
-            </w:tcMar>
-          </w:tcPr>
-          <w:p>
-            <w:r/>
-            <w:r>
-              <w:rPr>
-                <w:rFonts w:ascii="Consolas" w:hAnsi="Consolas"/>
-                <w:color w:val="C0392B"/>
-                <w:sz w:val="17"/>
-              </w:rPr>
-              <w:t>$</w:t>
-            </w:r>
-            <w:r/>
           </w:p>
         </w:tc>
       </w:tr>
       <w:tr>
         <w:tc>
           <w:tcPr>
-            <w:tcW w:type="dxa" w:w="2340"/>
-            <w:shd w:fill="F6F9F7"/>
-            <w:tcMar>
-              <w:top w:w="80" w:type="dxa"/>
-              <w:bottom w:w="80" w:type="dxa"/>
-              <w:left w:w="100" w:type="dxa"/>
-              <w:right w:w="100" w:type="dxa"/>
-            </w:tcMar>
+            <w:tcW w:type="dxa" w:w="4986"/>
+            <w:shd w:val="clear" w:color="auto" w:fill="F6F9F7"/>
           </w:tcPr>
           <w:p>
-            <w:r/>
             <w:r>
               <w:rPr>
-                <w:b/>
+                <w:sz w:val="18"/>
               </w:rPr>
-              <w:t>Europe (AIB)</w:t>
+              <w:t>✏️ Edit Answers</w:t>
             </w:r>
-            <w:r/>
           </w:p>
         </w:tc>
         <w:tc>
           <w:tcPr>
-            <w:tcW w:type="dxa" w:w="2340"/>
-            <w:shd w:fill="F6F9F7"/>
-            <w:tcMar>
-              <w:top w:w="80" w:type="dxa"/>
-              <w:bottom w:w="80" w:type="dxa"/>
-              <w:left w:w="100" w:type="dxa"/>
-              <w:right w:w="100" w:type="dxa"/>
-            </w:tcMar>
+            <w:tcW w:type="dxa" w:w="4986"/>
+            <w:shd w:val="clear" w:color="auto" w:fill="F6F9F7"/>
           </w:tcPr>
           <w:p>
-            <w:r/>
             <w:r>
               <w:rPr>
-                <w:rFonts w:ascii="Consolas" w:hAnsi="Consolas"/>
-                <w:color w:val="C0392B"/>
-                <w:sz w:val="17"/>
+                <w:sz w:val="18"/>
               </w:rPr>
-              <w:t>€0.25</w:t>
+              <w:t>Return to Section 1 — answers preserved</w:t>
             </w:r>
-            <w:r/>
+          </w:p>
+        </w:tc>
+      </w:tr>
+      <w:tr>
+        <w:tc>
+          <w:tcPr>
+            <w:tcW w:type="dxa" w:w="4986"/>
+            <w:shd w:val="clear" w:color="auto" w:fill="FFFFFF"/>
+          </w:tcPr>
+          <w:p>
+            <w:r>
+              <w:rPr>
+                <w:sz w:val="18"/>
+              </w:rPr>
+              <w:t>🔄 Retake</w:t>
+            </w:r>
           </w:p>
         </w:tc>
         <w:tc>
           <w:tcPr>
-            <w:tcW w:type="dxa" w:w="2340"/>
-            <w:shd w:fill="F6F9F7"/>
-            <w:tcMar>
-              <w:top w:w="80" w:type="dxa"/>
-              <w:bottom w:w="80" w:type="dxa"/>
-              <w:left w:w="100" w:type="dxa"/>
-              <w:right w:w="100" w:type="dxa"/>
-            </w:tcMar>
+            <w:tcW w:type="dxa" w:w="4986"/>
+            <w:shd w:val="clear" w:color="auto" w:fill="FFFFFF"/>
           </w:tcPr>
           <w:p>
-            <w:r/>
             <w:r>
               <w:rPr>
-                <w:rFonts w:ascii="Consolas" w:hAnsi="Consolas"/>
-                <w:color w:val="C0392B"/>
-                <w:sz w:val="17"/>
+                <w:sz w:val="18"/>
               </w:rPr>
-              <w:t>€0.09</w:t>
+              <w:t>Clear all answers — start fresh</w:t>
             </w:r>
-            <w:r/>
+          </w:p>
+        </w:tc>
+      </w:tr>
+    </w:tbl>
+    <w:p/>
+    <w:p>
+      <w:pPr>
+        <w:pStyle w:val="Heading1"/>
+        <w:spacing w:before="280" w:after="80"/>
+      </w:pPr>
+      <w:r>
+        <w:rPr>
+          <w:color w:val="1A6B3C"/>
+        </w:rPr>
+        <w:t>Bottom Bar (Always Visible)</w:t>
+      </w:r>
+    </w:p>
+    <w:tbl>
+      <w:tblPr>
+        <w:tblStyle w:val="TableGrid"/>
+        <w:tblW w:type="auto" w:w="0"/>
+        <w:tblLook w:firstColumn="1" w:firstRow="1" w:lastColumn="0" w:lastRow="0" w:noHBand="0" w:noVBand="1" w:val="04A0"/>
+      </w:tblPr>
+      <w:tblGrid>
+        <w:gridCol w:w="4986"/>
+        <w:gridCol w:w="4986"/>
+      </w:tblGrid>
+      <w:tr>
+        <w:tc>
+          <w:tcPr>
+            <w:tcW w:type="dxa" w:w="4986"/>
+            <w:shd w:val="clear" w:color="auto" w:fill="1A6B3C"/>
+          </w:tcPr>
+          <w:p>
+            <w:r>
+              <w:rPr>
+                <w:b/>
+                <w:color w:val="FFFFFF"/>
+                <w:sz w:val="18"/>
+              </w:rPr>
+              <w:t>Display / Button</w:t>
+            </w:r>
           </w:p>
         </w:tc>
         <w:tc>
           <w:tcPr>
-            <w:tcW w:type="dxa" w:w="2340"/>
-            <w:shd w:fill="F6F9F7"/>
-            <w:tcMar>
-              <w:top w:w="80" w:type="dxa"/>
-              <w:bottom w:w="80" w:type="dxa"/>
-              <w:left w:w="100" w:type="dxa"/>
-              <w:right w:w="100" w:type="dxa"/>
-            </w:tcMar>
+            <w:tcW w:type="dxa" w:w="4986"/>
+            <w:shd w:val="clear" w:color="auto" w:fill="1A6B3C"/>
           </w:tcPr>
           <w:p>
-            <w:r/>
             <w:r>
               <w:rPr>
-                <w:rFonts w:ascii="Consolas" w:hAnsi="Consolas"/>
-                <w:color w:val="C0392B"/>
-                <w:sz w:val="17"/>
+                <w:b/>
+                <w:color w:val="FFFFFF"/>
+                <w:sz w:val="18"/>
               </w:rPr>
-              <w:t>€</w:t>
+              <w:t>Meaning</w:t>
             </w:r>
-            <w:r/>
+          </w:p>
+        </w:tc>
+      </w:tr>
+      <w:tr>
+        <w:tc>
+          <w:tcPr>
+            <w:tcW w:type="dxa" w:w="4986"/>
+            <w:shd w:val="clear" w:color="auto" w:fill="F6F9F7"/>
+          </w:tcPr>
+          <w:p>
+            <w:r>
+              <w:rPr>
+                <w:sz w:val="18"/>
+              </w:rPr>
+              <w:t>● AI: Active (Claude/Gemini)</w:t>
+            </w:r>
+          </w:p>
+        </w:tc>
+        <w:tc>
+          <w:tcPr>
+            <w:tcW w:type="dxa" w:w="4986"/>
+            <w:shd w:val="clear" w:color="auto" w:fill="F6F9F7"/>
+          </w:tcPr>
+          <w:p>
+            <w:r>
+              <w:rPr>
+                <w:sz w:val="18"/>
+              </w:rPr>
+              <w:t>Admin or user AI key is enabled</w:t>
+            </w:r>
+          </w:p>
+        </w:tc>
+      </w:tr>
+      <w:tr>
+        <w:tc>
+          <w:tcPr>
+            <w:tcW w:type="dxa" w:w="4986"/>
+            <w:shd w:val="clear" w:color="auto" w:fill="FFFFFF"/>
+          </w:tcPr>
+          <w:p>
+            <w:r>
+              <w:rPr>
+                <w:sz w:val="18"/>
+              </w:rPr>
+              <w:t>● AI: Off</w:t>
+            </w:r>
+          </w:p>
+        </w:tc>
+        <w:tc>
+          <w:tcPr>
+            <w:tcW w:type="dxa" w:w="4986"/>
+            <w:shd w:val="clear" w:color="auto" w:fill="FFFFFF"/>
+          </w:tcPr>
+          <w:p>
+            <w:r>
+              <w:rPr>
+                <w:sz w:val="18"/>
+              </w:rPr>
+              <w:t>No AI key active — nudge boxes shown in results</w:t>
+            </w:r>
+          </w:p>
+        </w:tc>
+      </w:tr>
+      <w:tr>
+        <w:tc>
+          <w:tcPr>
+            <w:tcW w:type="dxa" w:w="4986"/>
+            <w:shd w:val="clear" w:color="auto" w:fill="F6F9F7"/>
+          </w:tcPr>
+          <w:p>
+            <w:r>
+              <w:rPr>
+                <w:sz w:val="18"/>
+              </w:rPr>
+              <w:t>📋 Business ESG Assessment in Progress</w:t>
+            </w:r>
+          </w:p>
+        </w:tc>
+        <w:tc>
+          <w:tcPr>
+            <w:tcW w:type="dxa" w:w="4986"/>
+            <w:shd w:val="clear" w:color="auto" w:fill="F6F9F7"/>
+          </w:tcPr>
+          <w:p>
+            <w:r>
+              <w:rPr>
+                <w:sz w:val="18"/>
+              </w:rPr>
+              <w:t>Shown while quiz is running</w:t>
+            </w:r>
+          </w:p>
+        </w:tc>
+      </w:tr>
+      <w:tr>
+        <w:tc>
+          <w:tcPr>
+            <w:tcW w:type="dxa" w:w="4986"/>
+            <w:shd w:val="clear" w:color="auto" w:fill="FFFFFF"/>
+          </w:tcPr>
+          <w:p>
+            <w:r>
+              <w:rPr>
+                <w:sz w:val="18"/>
+              </w:rPr>
+              <w:t>🚀 Start Assessment / 📋 Resume Assessment</w:t>
+            </w:r>
+          </w:p>
+        </w:tc>
+        <w:tc>
+          <w:tcPr>
+            <w:tcW w:type="dxa" w:w="4986"/>
+            <w:shd w:val="clear" w:color="auto" w:fill="FFFFFF"/>
+          </w:tcPr>
+          <w:p>
+            <w:r>
+              <w:rPr>
+                <w:sz w:val="18"/>
+              </w:rPr>
+              <w:t>Shown on welcome screen</w:t>
+            </w:r>
+          </w:p>
+        </w:tc>
+      </w:tr>
+      <w:tr>
+        <w:tc>
+          <w:tcPr>
+            <w:tcW w:type="dxa" w:w="4986"/>
+            <w:shd w:val="clear" w:color="auto" w:fill="F6F9F7"/>
+          </w:tcPr>
+          <w:p>
+            <w:r>
+              <w:rPr>
+                <w:sz w:val="18"/>
+              </w:rPr>
+              <w:t>🔄 Restart / Retake</w:t>
+            </w:r>
+          </w:p>
+        </w:tc>
+        <w:tc>
+          <w:tcPr>
+            <w:tcW w:type="dxa" w:w="4986"/>
+            <w:shd w:val="clear" w:color="auto" w:fill="F6F9F7"/>
+          </w:tcPr>
+          <w:p>
+            <w:r>
+              <w:rPr>
+                <w:sz w:val="18"/>
+              </w:rPr>
+              <w:t>Shown on results screen</w:t>
+            </w:r>
+          </w:p>
+        </w:tc>
+      </w:tr>
+      <w:tr>
+        <w:tc>
+          <w:tcPr>
+            <w:tcW w:type="dxa" w:w="4986"/>
+            <w:shd w:val="clear" w:color="auto" w:fill="FFFFFF"/>
+          </w:tcPr>
+          <w:p>
+            <w:r>
+              <w:rPr>
+                <w:sz w:val="18"/>
+              </w:rPr>
+              <w:t>⚙️ Admin Settings</w:t>
+            </w:r>
+          </w:p>
+        </w:tc>
+        <w:tc>
+          <w:tcPr>
+            <w:tcW w:type="dxa" w:w="4986"/>
+            <w:shd w:val="clear" w:color="auto" w:fill="FFFFFF"/>
+          </w:tcPr>
+          <w:p>
+            <w:r>
+              <w:rPr>
+                <w:sz w:val="18"/>
+              </w:rPr>
+              <w:t>Opens password-protected admin panel</w:t>
+            </w:r>
           </w:p>
         </w:tc>
       </w:tr>
     </w:tbl>
+    <w:p/>
     <w:p>
       <w:pPr>
         <w:pStyle w:val="Heading1"/>
+        <w:spacing w:before="280" w:after="80"/>
       </w:pPr>
       <w:r>
-        <w:t>4. B-Corp Eligibility &amp; Fee Model</w:t>
+        <w:rPr>
+          <w:color w:val="1A6B3C"/>
+        </w:rPr>
+        <w:t>AI Setup — Two Options</w:t>
+      </w:r>
+    </w:p>
+    <w:tbl>
+      <w:tblPr>
+        <w:tblStyle w:val="TableGrid"/>
+        <w:tblW w:type="auto" w:w="0"/>
+        <w:tblLook w:firstColumn="1" w:firstRow="1" w:lastColumn="0" w:lastRow="0" w:noHBand="0" w:noVBand="1" w:val="04A0"/>
+      </w:tblPr>
+      <w:tblGrid>
+        <w:gridCol w:w="4986"/>
+        <w:gridCol w:w="4986"/>
+      </w:tblGrid>
+      <w:tr>
+        <w:tc>
+          <w:tcPr>
+            <w:tcW w:type="dxa" w:w="4986"/>
+            <w:shd w:val="clear" w:color="auto" w:fill="1A6B3C"/>
+          </w:tcPr>
+          <w:p>
+            <w:r>
+              <w:rPr>
+                <w:b/>
+                <w:color w:val="FFFFFF"/>
+                <w:sz w:val="18"/>
+              </w:rPr>
+              <w:t>Option</w:t>
+            </w:r>
+          </w:p>
+        </w:tc>
+        <w:tc>
+          <w:tcPr>
+            <w:tcW w:type="dxa" w:w="4986"/>
+            <w:shd w:val="clear" w:color="auto" w:fill="1A6B3C"/>
+          </w:tcPr>
+          <w:p>
+            <w:r>
+              <w:rPr>
+                <w:b/>
+                <w:color w:val="FFFFFF"/>
+                <w:sz w:val="18"/>
+              </w:rPr>
+              <w:t>How To</w:t>
+            </w:r>
+          </w:p>
+        </w:tc>
+      </w:tr>
+      <w:tr>
+        <w:tc>
+          <w:tcPr>
+            <w:tcW w:type="dxa" w:w="4986"/>
+            <w:shd w:val="clear" w:color="auto" w:fill="F6F9F7"/>
+          </w:tcPr>
+          <w:p>
+            <w:r>
+              <w:rPr>
+                <w:sz w:val="18"/>
+              </w:rPr>
+              <w:t>Admin AI (for all users)</w:t>
+            </w:r>
+          </w:p>
+        </w:tc>
+        <w:tc>
+          <w:tcPr>
+            <w:tcW w:type="dxa" w:w="4986"/>
+            <w:shd w:val="clear" w:color="auto" w:fill="F6F9F7"/>
+          </w:tcPr>
+          <w:p>
+            <w:r>
+              <w:rPr>
+                <w:sz w:val="18"/>
+              </w:rPr>
+              <w:t>Admin Settings → AI Advisor Settings → paste key → Save → toggle Enable AI</w:t>
+            </w:r>
+          </w:p>
+        </w:tc>
+      </w:tr>
+      <w:tr>
+        <w:tc>
+          <w:tcPr>
+            <w:tcW w:type="dxa" w:w="4986"/>
+            <w:shd w:val="clear" w:color="auto" w:fill="FFFFFF"/>
+          </w:tcPr>
+          <w:p>
+            <w:r>
+              <w:rPr>
+                <w:sz w:val="18"/>
+              </w:rPr>
+              <w:t>My AI (personal, welcome screen)</w:t>
+            </w:r>
+          </w:p>
+        </w:tc>
+        <w:tc>
+          <w:tcPr>
+            <w:tcW w:type="dxa" w:w="4986"/>
+            <w:shd w:val="clear" w:color="auto" w:fill="FFFFFF"/>
+          </w:tcPr>
+          <w:p>
+            <w:r>
+              <w:rPr>
+                <w:sz w:val="18"/>
+              </w:rPr>
+              <w:t>Welcome screen → expand '⚡ My AI Settings' → choose provider → paste key → 'Save &amp; Enable'</w:t>
+            </w:r>
+          </w:p>
+        </w:tc>
+      </w:tr>
+      <w:tr>
+        <w:tc>
+          <w:tcPr>
+            <w:tcW w:type="dxa" w:w="4986"/>
+            <w:shd w:val="clear" w:color="auto" w:fill="F6F9F7"/>
+          </w:tcPr>
+          <w:p>
+            <w:r>
+              <w:rPr>
+                <w:sz w:val="18"/>
+              </w:rPr>
+              <w:t>Priority rule</w:t>
+            </w:r>
+          </w:p>
+        </w:tc>
+        <w:tc>
+          <w:tcPr>
+            <w:tcW w:type="dxa" w:w="4986"/>
+            <w:shd w:val="clear" w:color="auto" w:fill="F6F9F7"/>
+          </w:tcPr>
+          <w:p>
+            <w:r>
+              <w:rPr>
+                <w:sz w:val="18"/>
+              </w:rPr>
+              <w:t>Admin key always overrides personal key. If both are set, admin key is used.</w:t>
+            </w:r>
+          </w:p>
+        </w:tc>
+      </w:tr>
+      <w:tr>
+        <w:tc>
+          <w:tcPr>
+            <w:tcW w:type="dxa" w:w="4986"/>
+            <w:shd w:val="clear" w:color="auto" w:fill="FFFFFF"/>
+          </w:tcPr>
+          <w:p>
+            <w:r>
+              <w:rPr>
+                <w:sz w:val="18"/>
+              </w:rPr>
+              <w:t>Cost (approx.)</w:t>
+            </w:r>
+          </w:p>
+        </w:tc>
+        <w:tc>
+          <w:tcPr>
+            <w:tcW w:type="dxa" w:w="4986"/>
+            <w:shd w:val="clear" w:color="auto" w:fill="FFFFFF"/>
+          </w:tcPr>
+          <w:p>
+            <w:r>
+              <w:rPr>
+                <w:sz w:val="18"/>
+              </w:rPr>
+              <w:t>Anthropic Claude ~£0.004/session  |  Google Gemini ~£0.002/session</w:t>
+            </w:r>
+          </w:p>
+        </w:tc>
+      </w:tr>
+    </w:tbl>
+    <w:p/>
+    <w:tbl>
+      <w:tblPr>
+        <w:tblStyle w:val="TableGrid"/>
+        <w:tblW w:type="auto" w:w="0"/>
+        <w:tblLook w:firstColumn="1" w:firstRow="1" w:lastColumn="0" w:lastRow="0" w:noHBand="0" w:noVBand="1" w:val="04A0"/>
+      </w:tblPr>
+      <w:tblGrid>
+        <w:gridCol w:w="9972"/>
+      </w:tblGrid>
+      <w:tr>
+        <w:tc>
+          <w:tcPr>
+            <w:tcW w:type="dxa" w:w="8640"/>
+            <w:shd w:val="clear" w:color="auto" w:fill="D8E6F5"/>
+          </w:tcPr>
+          <w:p>
+            <w:r>
+              <w:rPr>
+                <w:b/>
+                <w:color w:val="3B5F8A"/>
+                <w:sz w:val="20"/>
+              </w:rPr>
+              <w:t>My AI Settings — Key Points</w:t>
+            </w:r>
+          </w:p>
+          <w:p>
+            <w:r>
+              <w:rPr>
+                <w:sz w:val="19"/>
+              </w:rPr>
+              <w:t>• Your key is stored ONLY in your browser — never shared with i-nocarbon</w:t>
+            </w:r>
+          </w:p>
+          <w:p>
+            <w:r>
+              <w:rPr>
+                <w:sz w:val="19"/>
+              </w:rPr>
+              <w:t>• Clearing browser data deletes your saved key</w:t>
+            </w:r>
+          </w:p>
+          <w:p>
+            <w:r>
+              <w:rPr>
+                <w:sz w:val="19"/>
+              </w:rPr>
+              <w:t>• If admin key is active, status shows 'Admin key is active — your key saved as fallback'</w:t>
+            </w:r>
+          </w:p>
+          <w:p>
+            <w:r>
+              <w:rPr>
+                <w:sz w:val="19"/>
+              </w:rPr>
+              <w:t>• If your key is active, status shows '✓ Your key is active (Anthropic/Gemini)'</w:t>
+            </w:r>
+          </w:p>
+        </w:tc>
+      </w:tr>
+    </w:tbl>
+    <w:p/>
+    <w:p>
+      <w:pPr>
+        <w:pStyle w:val="Heading1"/>
+        <w:spacing w:before="280" w:after="80"/>
+      </w:pPr>
+      <w:r>
+        <w:rPr>
+          <w:color w:val="1A6B3C"/>
+        </w:rPr>
+        <w:t>Satisfaction Gate</w:t>
       </w:r>
     </w:p>
     <w:p>
       <w:pPr>
-        <w:pStyle w:val="Heading2"/>
+        <w:spacing w:after="120"/>
       </w:pPr>
       <w:r>
-        <w:t>Eligibility Tracks</w:t>
+        <w:rPr>
+          <w:b w:val="0"/>
+          <w:i w:val="0"/>
+          <w:sz w:val="20"/>
+        </w:rPr>
+        <w:t>Appears after clicking 'See My ESG Score →' on the details screen:</w:t>
+      </w:r>
+    </w:p>
+    <w:tbl>
+      <w:tblPr>
+        <w:tblStyle w:val="TableGrid"/>
+        <w:tblW w:type="auto" w:w="0"/>
+        <w:tblLook w:firstColumn="1" w:firstRow="1" w:lastColumn="0" w:lastRow="0" w:noHBand="0" w:noVBand="1" w:val="04A0"/>
+      </w:tblPr>
+      <w:tblGrid>
+        <w:gridCol w:w="4986"/>
+        <w:gridCol w:w="4986"/>
+      </w:tblGrid>
+      <w:tr>
+        <w:tc>
+          <w:tcPr>
+            <w:tcW w:type="dxa" w:w="4986"/>
+            <w:shd w:val="clear" w:color="auto" w:fill="1A6B3C"/>
+          </w:tcPr>
+          <w:p>
+            <w:r>
+              <w:rPr>
+                <w:b/>
+                <w:color w:val="FFFFFF"/>
+                <w:sz w:val="18"/>
+              </w:rPr>
+              <w:t>Option</w:t>
+            </w:r>
+          </w:p>
+        </w:tc>
+        <w:tc>
+          <w:tcPr>
+            <w:tcW w:type="dxa" w:w="4986"/>
+            <w:shd w:val="clear" w:color="auto" w:fill="1A6B3C"/>
+          </w:tcPr>
+          <w:p>
+            <w:r>
+              <w:rPr>
+                <w:b/>
+                <w:color w:val="FFFFFF"/>
+                <w:sz w:val="18"/>
+              </w:rPr>
+              <w:t>What Happens</w:t>
+            </w:r>
+          </w:p>
+        </w:tc>
+      </w:tr>
+      <w:tr>
+        <w:tc>
+          <w:tcPr>
+            <w:tcW w:type="dxa" w:w="4986"/>
+            <w:shd w:val="clear" w:color="auto" w:fill="F6F9F7"/>
+          </w:tcPr>
+          <w:p>
+            <w:r>
+              <w:rPr>
+                <w:sz w:val="18"/>
+              </w:rPr>
+              <w:t>✏️ Edit My Answers</w:t>
+            </w:r>
+          </w:p>
+        </w:tc>
+        <w:tc>
+          <w:tcPr>
+            <w:tcW w:type="dxa" w:w="4986"/>
+            <w:shd w:val="clear" w:color="auto" w:fill="F6F9F7"/>
+          </w:tcPr>
+          <w:p>
+            <w:r>
+              <w:rPr>
+                <w:sz w:val="18"/>
+              </w:rPr>
+              <w:t>Returns to Section 1 — all existing answers are pre-filled</w:t>
+            </w:r>
+          </w:p>
+        </w:tc>
+      </w:tr>
+      <w:tr>
+        <w:tc>
+          <w:tcPr>
+            <w:tcW w:type="dxa" w:w="4986"/>
+            <w:shd w:val="clear" w:color="auto" w:fill="FFFFFF"/>
+          </w:tcPr>
+          <w:p>
+            <w:r>
+              <w:rPr>
+                <w:sz w:val="18"/>
+              </w:rPr>
+              <w:t>✓ Yes, Show My Report</w:t>
+            </w:r>
+          </w:p>
+        </w:tc>
+        <w:tc>
+          <w:tcPr>
+            <w:tcW w:type="dxa" w:w="4986"/>
+            <w:shd w:val="clear" w:color="auto" w:fill="FFFFFF"/>
+          </w:tcPr>
+          <w:p>
+            <w:r>
+              <w:rPr>
+                <w:sz w:val="18"/>
+              </w:rPr>
+              <w:t>Proceeds to full results immediately</w:t>
+            </w:r>
+          </w:p>
+        </w:tc>
+      </w:tr>
+      <w:tr>
+        <w:tc>
+          <w:tcPr>
+            <w:tcW w:type="dxa" w:w="4986"/>
+            <w:shd w:val="clear" w:color="auto" w:fill="F6F9F7"/>
+          </w:tcPr>
+          <w:p>
+            <w:r>
+              <w:rPr>
+                <w:sz w:val="18"/>
+              </w:rPr>
+              <w:t>Skip link</w:t>
+            </w:r>
+          </w:p>
+        </w:tc>
+        <w:tc>
+          <w:tcPr>
+            <w:tcW w:type="dxa" w:w="4986"/>
+            <w:shd w:val="clear" w:color="auto" w:fill="F6F9F7"/>
+          </w:tcPr>
+          <w:p>
+            <w:r>
+              <w:rPr>
+                <w:sz w:val="18"/>
+              </w:rPr>
+              <w:t>Bypasses gate and goes straight to results</w:t>
+            </w:r>
+          </w:p>
+        </w:tc>
+      </w:tr>
+    </w:tbl>
+    <w:p/>
+    <w:p>
+      <w:pPr>
+        <w:pStyle w:val="Heading1"/>
+        <w:spacing w:before="280" w:after="80"/>
+      </w:pPr>
+      <w:r>
+        <w:rPr>
+          <w:color w:val="1A6B3C"/>
+        </w:rPr>
+        <w:t>Branding Controls (Admin Only)</w:t>
+      </w:r>
+    </w:p>
+    <w:tbl>
+      <w:tblPr>
+        <w:tblStyle w:val="TableGrid"/>
+        <w:tblW w:type="auto" w:w="0"/>
+        <w:tblLook w:firstColumn="1" w:firstRow="1" w:lastColumn="0" w:lastRow="0" w:noHBand="0" w:noVBand="1" w:val="04A0"/>
+      </w:tblPr>
+      <w:tblGrid>
+        <w:gridCol w:w="4986"/>
+        <w:gridCol w:w="4986"/>
+      </w:tblGrid>
+      <w:tr>
+        <w:tc>
+          <w:tcPr>
+            <w:tcW w:type="dxa" w:w="4986"/>
+            <w:shd w:val="clear" w:color="auto" w:fill="1A6B3C"/>
+          </w:tcPr>
+          <w:p>
+            <w:r>
+              <w:rPr>
+                <w:b/>
+                <w:color w:val="FFFFFF"/>
+                <w:sz w:val="18"/>
+              </w:rPr>
+              <w:t>Control</w:t>
+            </w:r>
+          </w:p>
+        </w:tc>
+        <w:tc>
+          <w:tcPr>
+            <w:tcW w:type="dxa" w:w="4986"/>
+            <w:shd w:val="clear" w:color="auto" w:fill="1A6B3C"/>
+          </w:tcPr>
+          <w:p>
+            <w:r>
+              <w:rPr>
+                <w:b/>
+                <w:color w:val="FFFFFF"/>
+                <w:sz w:val="18"/>
+              </w:rPr>
+              <w:t>Effect</w:t>
+            </w:r>
+          </w:p>
+        </w:tc>
+      </w:tr>
+      <w:tr>
+        <w:tc>
+          <w:tcPr>
+            <w:tcW w:type="dxa" w:w="4986"/>
+            <w:shd w:val="clear" w:color="auto" w:fill="F6F9F7"/>
+          </w:tcPr>
+          <w:p>
+            <w:r>
+              <w:rPr>
+                <w:sz w:val="18"/>
+              </w:rPr>
+              <w:t>Company Name field</w:t>
+            </w:r>
+          </w:p>
+        </w:tc>
+        <w:tc>
+          <w:tcPr>
+            <w:tcW w:type="dxa" w:w="4986"/>
+            <w:shd w:val="clear" w:color="auto" w:fill="F6F9F7"/>
+          </w:tcPr>
+          <w:p>
+            <w:r>
+              <w:rPr>
+                <w:sz w:val="18"/>
+              </w:rPr>
+              <w:t>Replaces 'ESG Diagnostics' in the quiz header and report</w:t>
+            </w:r>
+          </w:p>
+        </w:tc>
+      </w:tr>
+      <w:tr>
+        <w:tc>
+          <w:tcPr>
+            <w:tcW w:type="dxa" w:w="4986"/>
+            <w:shd w:val="clear" w:color="auto" w:fill="FFFFFF"/>
+          </w:tcPr>
+          <w:p>
+            <w:r>
+              <w:rPr>
+                <w:sz w:val="18"/>
+              </w:rPr>
+              <w:t>Logo URL field</w:t>
+            </w:r>
+          </w:p>
+        </w:tc>
+        <w:tc>
+          <w:tcPr>
+            <w:tcW w:type="dxa" w:w="4986"/>
+            <w:shd w:val="clear" w:color="auto" w:fill="FFFFFF"/>
+          </w:tcPr>
+          <w:p>
+            <w:r>
+              <w:rPr>
+                <w:sz w:val="18"/>
+              </w:rPr>
+              <w:t>Displays a custom circular logo (leave blank for default leaf emoji 🌿)</w:t>
+            </w:r>
+          </w:p>
+        </w:tc>
+      </w:tr>
+      <w:tr>
+        <w:tc>
+          <w:tcPr>
+            <w:tcW w:type="dxa" w:w="4986"/>
+            <w:shd w:val="clear" w:color="auto" w:fill="F6F9F7"/>
+          </w:tcPr>
+          <w:p>
+            <w:r>
+              <w:rPr>
+                <w:sz w:val="18"/>
+              </w:rPr>
+              <w:t>Show i-nocarbon branding &amp; logo</w:t>
+            </w:r>
+          </w:p>
+        </w:tc>
+        <w:tc>
+          <w:tcPr>
+            <w:tcW w:type="dxa" w:w="4986"/>
+            <w:shd w:val="clear" w:color="auto" w:fill="F6F9F7"/>
+          </w:tcPr>
+          <w:p>
+            <w:r>
+              <w:rPr>
+                <w:sz w:val="18"/>
+              </w:rPr>
+              <w:t>Tick to display the i-nocarbon circular logo and contact details (opt-in — off by default)</w:t>
+            </w:r>
+          </w:p>
+        </w:tc>
+      </w:tr>
+      <w:tr>
+        <w:tc>
+          <w:tcPr>
+            <w:tcW w:type="dxa" w:w="4986"/>
+            <w:shd w:val="clear" w:color="auto" w:fill="FFFFFF"/>
+          </w:tcPr>
+          <w:p>
+            <w:r>
+              <w:rPr>
+                <w:sz w:val="18"/>
+              </w:rPr>
+              <w:t>Default state</w:t>
+            </w:r>
+          </w:p>
+        </w:tc>
+        <w:tc>
+          <w:tcPr>
+            <w:tcW w:type="dxa" w:w="4986"/>
+            <w:shd w:val="clear" w:color="auto" w:fill="FFFFFF"/>
+          </w:tcPr>
+          <w:p>
+            <w:r>
+              <w:rPr>
+                <w:sz w:val="18"/>
+              </w:rPr>
+              <w:t>No logo shown by default — just the 🌿 leaf emoji</w:t>
+            </w:r>
+          </w:p>
+        </w:tc>
+      </w:tr>
+    </w:tbl>
+    <w:p/>
+    <w:tbl>
+      <w:tblPr>
+        <w:tblStyle w:val="TableGrid"/>
+        <w:tblW w:type="auto" w:w="0"/>
+        <w:tblLook w:firstColumn="1" w:firstRow="1" w:lastColumn="0" w:lastRow="0" w:noHBand="0" w:noVBand="1" w:val="04A0"/>
+      </w:tblPr>
+      <w:tblGrid>
+        <w:gridCol w:w="9972"/>
+      </w:tblGrid>
+      <w:tr>
+        <w:tc>
+          <w:tcPr>
+            <w:tcW w:type="dxa" w:w="8640"/>
+            <w:shd w:val="clear" w:color="auto" w:fill="FAEBD4"/>
+          </w:tcPr>
+          <w:p>
+            <w:r>
+              <w:rPr>
+                <w:b/>
+                <w:color w:val="C97B22"/>
+                <w:sz w:val="20"/>
+              </w:rPr>
+              <w:t>Branding Default Behaviour (V4.1 change)</w:t>
+            </w:r>
+          </w:p>
+          <w:p>
+            <w:r>
+              <w:rPr>
+                <w:sz w:val="19"/>
+              </w:rPr>
+              <w:t>The 'Show i-nocarbon branding &amp; logo' checkbox is now UNTICKED by default.</w:t>
+            </w:r>
+          </w:p>
+          <w:p>
+            <w:r>
+              <w:rPr>
+                <w:sz w:val="19"/>
+              </w:rPr>
+              <w:t>The i-nocarbon circular logo only appears if you tick this box or enter a custom Logo URL.</w:t>
+            </w:r>
+          </w:p>
+          <w:p>
+            <w:r>
+              <w:rPr>
+                <w:sz w:val="19"/>
+              </w:rPr>
+              <w:t>Previous setting (inc_hide_inc) is automatically migrated on first load.</w:t>
+            </w:r>
+          </w:p>
+        </w:tc>
+      </w:tr>
+    </w:tbl>
+    <w:p/>
+    <w:p>
+      <w:pPr>
+        <w:pStyle w:val="Heading1"/>
+        <w:spacing w:before="280" w:after="80"/>
+      </w:pPr>
+      <w:r>
+        <w:rPr>
+          <w:color w:val="1A6B3C"/>
+        </w:rPr>
+        <w:t>PDF Report — AI Disclosure</w:t>
+      </w:r>
+    </w:p>
+    <w:tbl>
+      <w:tblPr>
+        <w:tblStyle w:val="TableGrid"/>
+        <w:tblW w:type="auto" w:w="0"/>
+        <w:tblLook w:firstColumn="1" w:firstRow="1" w:lastColumn="0" w:lastRow="0" w:noHBand="0" w:noVBand="1" w:val="04A0"/>
+      </w:tblPr>
+      <w:tblGrid>
+        <w:gridCol w:w="4986"/>
+        <w:gridCol w:w="4986"/>
+      </w:tblGrid>
+      <w:tr>
+        <w:tc>
+          <w:tcPr>
+            <w:tcW w:type="dxa" w:w="4986"/>
+            <w:shd w:val="clear" w:color="auto" w:fill="1A6B3C"/>
+          </w:tcPr>
+          <w:p>
+            <w:r>
+              <w:rPr>
+                <w:b/>
+                <w:color w:val="FFFFFF"/>
+                <w:sz w:val="18"/>
+              </w:rPr>
+              <w:t>AI Status</w:t>
+            </w:r>
+          </w:p>
+        </w:tc>
+        <w:tc>
+          <w:tcPr>
+            <w:tcW w:type="dxa" w:w="4986"/>
+            <w:shd w:val="clear" w:color="auto" w:fill="1A6B3C"/>
+          </w:tcPr>
+          <w:p>
+            <w:r>
+              <w:rPr>
+                <w:b/>
+                <w:color w:val="FFFFFF"/>
+                <w:sz w:val="18"/>
+              </w:rPr>
+              <w:t>What Appears in PDF</w:t>
+            </w:r>
+          </w:p>
+        </w:tc>
+      </w:tr>
+      <w:tr>
+        <w:tc>
+          <w:tcPr>
+            <w:tcW w:type="dxa" w:w="4986"/>
+            <w:shd w:val="clear" w:color="auto" w:fill="F6F9F7"/>
+          </w:tcPr>
+          <w:p>
+            <w:r>
+              <w:rPr>
+                <w:sz w:val="18"/>
+              </w:rPr>
+              <w:t>AI On</w:t>
+            </w:r>
+          </w:p>
+        </w:tc>
+        <w:tc>
+          <w:tcPr>
+            <w:tcW w:type="dxa" w:w="4986"/>
+            <w:shd w:val="clear" w:color="auto" w:fill="F6F9F7"/>
+          </w:tcPr>
+          <w:p>
+            <w:r>
+              <w:rPr>
+                <w:sz w:val="18"/>
+              </w:rPr>
+              <w:t>Green '✨ AI-ENHANCED REPORT' banner at top  +  personalised executive summary included</w:t>
+            </w:r>
+          </w:p>
+        </w:tc>
+      </w:tr>
+      <w:tr>
+        <w:tc>
+          <w:tcPr>
+            <w:tcW w:type="dxa" w:w="4986"/>
+            <w:shd w:val="clear" w:color="auto" w:fill="FFFFFF"/>
+          </w:tcPr>
+          <w:p>
+            <w:r>
+              <w:rPr>
+                <w:sz w:val="18"/>
+              </w:rPr>
+              <w:t>AI Off</w:t>
+            </w:r>
+          </w:p>
+        </w:tc>
+        <w:tc>
+          <w:tcPr>
+            <w:tcW w:type="dxa" w:w="4986"/>
+            <w:shd w:val="clear" w:color="auto" w:fill="FFFFFF"/>
+          </w:tcPr>
+          <w:p>
+            <w:r>
+              <w:rPr>
+                <w:sz w:val="18"/>
+              </w:rPr>
+              <w:t>Grey 'AI ADVISOR STATUS: DEACTIVATED' box explaining what AI would add</w:t>
+            </w:r>
+          </w:p>
+        </w:tc>
+      </w:tr>
+      <w:tr>
+        <w:tc>
+          <w:tcPr>
+            <w:tcW w:type="dxa" w:w="4986"/>
+            <w:shd w:val="clear" w:color="auto" w:fill="F6F9F7"/>
+          </w:tcPr>
+          <w:p>
+            <w:r>
+              <w:rPr>
+                <w:sz w:val="18"/>
+              </w:rPr>
+              <w:t>Footer</w:t>
+            </w:r>
+          </w:p>
+        </w:tc>
+        <w:tc>
+          <w:tcPr>
+            <w:tcW w:type="dxa" w:w="4986"/>
+            <w:shd w:val="clear" w:color="auto" w:fill="F6F9F7"/>
+          </w:tcPr>
+          <w:p>
+            <w:r>
+              <w:rPr>
+                <w:sz w:val="18"/>
+              </w:rPr>
+              <w:t>Shows: 'AI: [Provider] (active)' or 'AI: not enabled for this report'</w:t>
+            </w:r>
+          </w:p>
+        </w:tc>
+      </w:tr>
+    </w:tbl>
+    <w:p/>
+    <w:p>
+      <w:pPr>
+        <w:pStyle w:val="Heading1"/>
+        <w:spacing w:before="280" w:after="80"/>
+      </w:pPr>
+      <w:r>
+        <w:rPr>
+          <w:color w:val="1A6B3C"/>
+        </w:rPr>
+        <w:t>ESG Score Bands</w:t>
+      </w:r>
+    </w:p>
+    <w:tbl>
+      <w:tblPr>
+        <w:tblStyle w:val="TableGrid"/>
+        <w:tblW w:type="auto" w:w="0"/>
+        <w:tblLook w:firstColumn="1" w:firstRow="1" w:lastColumn="0" w:lastRow="0" w:noHBand="0" w:noVBand="1" w:val="04A0"/>
+      </w:tblPr>
+      <w:tblGrid>
+        <w:gridCol w:w="4986"/>
+        <w:gridCol w:w="4986"/>
+      </w:tblGrid>
+      <w:tr>
+        <w:tc>
+          <w:tcPr>
+            <w:tcW w:type="dxa" w:w="4986"/>
+            <w:shd w:val="clear" w:color="auto" w:fill="1A6B3C"/>
+          </w:tcPr>
+          <w:p>
+            <w:r>
+              <w:rPr>
+                <w:b/>
+                <w:color w:val="FFFFFF"/>
+                <w:sz w:val="18"/>
+              </w:rPr>
+              <w:t>Score</w:t>
+            </w:r>
+          </w:p>
+        </w:tc>
+        <w:tc>
+          <w:tcPr>
+            <w:tcW w:type="dxa" w:w="4986"/>
+            <w:shd w:val="clear" w:color="auto" w:fill="1A6B3C"/>
+          </w:tcPr>
+          <w:p>
+            <w:r>
+              <w:rPr>
+                <w:b/>
+                <w:color w:val="FFFFFF"/>
+                <w:sz w:val="18"/>
+              </w:rPr>
+              <w:t>Band</w:t>
+            </w:r>
+          </w:p>
+        </w:tc>
+      </w:tr>
+      <w:tr>
+        <w:tc>
+          <w:tcPr>
+            <w:tcW w:type="dxa" w:w="4986"/>
+            <w:shd w:val="clear" w:color="auto" w:fill="F6F9F7"/>
+          </w:tcPr>
+          <w:p>
+            <w:r>
+              <w:rPr>
+                <w:sz w:val="18"/>
+              </w:rPr>
+              <w:t>0 – 24</w:t>
+            </w:r>
+          </w:p>
+        </w:tc>
+        <w:tc>
+          <w:tcPr>
+            <w:tcW w:type="dxa" w:w="4986"/>
+            <w:shd w:val="clear" w:color="auto" w:fill="F6F9F7"/>
+          </w:tcPr>
+          <w:p>
+            <w:r>
+              <w:rPr>
+                <w:sz w:val="18"/>
+              </w:rPr>
+              <w:t>Early Stage</w:t>
+            </w:r>
+          </w:p>
+        </w:tc>
+      </w:tr>
+      <w:tr>
+        <w:tc>
+          <w:tcPr>
+            <w:tcW w:type="dxa" w:w="4986"/>
+            <w:shd w:val="clear" w:color="auto" w:fill="FFFFFF"/>
+          </w:tcPr>
+          <w:p>
+            <w:r>
+              <w:rPr>
+                <w:sz w:val="18"/>
+              </w:rPr>
+              <w:t>25 – 44</w:t>
+            </w:r>
+          </w:p>
+        </w:tc>
+        <w:tc>
+          <w:tcPr>
+            <w:tcW w:type="dxa" w:w="4986"/>
+            <w:shd w:val="clear" w:color="auto" w:fill="FFFFFF"/>
+          </w:tcPr>
+          <w:p>
+            <w:r>
+              <w:rPr>
+                <w:sz w:val="18"/>
+              </w:rPr>
+              <w:t>Developing</w:t>
+            </w:r>
+          </w:p>
+        </w:tc>
+      </w:tr>
+      <w:tr>
+        <w:tc>
+          <w:tcPr>
+            <w:tcW w:type="dxa" w:w="4986"/>
+            <w:shd w:val="clear" w:color="auto" w:fill="F6F9F7"/>
+          </w:tcPr>
+          <w:p>
+            <w:r>
+              <w:rPr>
+                <w:sz w:val="18"/>
+              </w:rPr>
+              <w:t>45 – 64</w:t>
+            </w:r>
+          </w:p>
+        </w:tc>
+        <w:tc>
+          <w:tcPr>
+            <w:tcW w:type="dxa" w:w="4986"/>
+            <w:shd w:val="clear" w:color="auto" w:fill="F6F9F7"/>
+          </w:tcPr>
+          <w:p>
+            <w:r>
+              <w:rPr>
+                <w:sz w:val="18"/>
+              </w:rPr>
+              <w:t>Progressing</w:t>
+            </w:r>
+          </w:p>
+        </w:tc>
+      </w:tr>
+      <w:tr>
+        <w:tc>
+          <w:tcPr>
+            <w:tcW w:type="dxa" w:w="4986"/>
+            <w:shd w:val="clear" w:color="auto" w:fill="FFFFFF"/>
+          </w:tcPr>
+          <w:p>
+            <w:r>
+              <w:rPr>
+                <w:sz w:val="18"/>
+              </w:rPr>
+              <w:t>65 – 79</w:t>
+            </w:r>
+          </w:p>
+        </w:tc>
+        <w:tc>
+          <w:tcPr>
+            <w:tcW w:type="dxa" w:w="4986"/>
+            <w:shd w:val="clear" w:color="auto" w:fill="FFFFFF"/>
+          </w:tcPr>
+          <w:p>
+            <w:r>
+              <w:rPr>
+                <w:sz w:val="18"/>
+              </w:rPr>
+              <w:t>Maturing</w:t>
+            </w:r>
+          </w:p>
+        </w:tc>
+      </w:tr>
+      <w:tr>
+        <w:tc>
+          <w:tcPr>
+            <w:tcW w:type="dxa" w:w="4986"/>
+            <w:shd w:val="clear" w:color="auto" w:fill="F6F9F7"/>
+          </w:tcPr>
+          <w:p>
+            <w:r>
+              <w:rPr>
+                <w:sz w:val="18"/>
+              </w:rPr>
+              <w:t>80 – 100</w:t>
+            </w:r>
+          </w:p>
+        </w:tc>
+        <w:tc>
+          <w:tcPr>
+            <w:tcW w:type="dxa" w:w="4986"/>
+            <w:shd w:val="clear" w:color="auto" w:fill="F6F9F7"/>
+          </w:tcPr>
+          <w:p>
+            <w:r>
+              <w:rPr>
+                <w:sz w:val="18"/>
+              </w:rPr>
+              <w:t>Leading</w:t>
+            </w:r>
+          </w:p>
+        </w:tc>
+      </w:tr>
+    </w:tbl>
+    <w:p/>
+    <w:p>
+      <w:pPr>
+        <w:pStyle w:val="Heading1"/>
+        <w:spacing w:before="280" w:after="80"/>
+      </w:pPr>
+      <w:r>
+        <w:rPr>
+          <w:color w:val="1A6B3C"/>
+        </w:rPr>
+        <w:t>Admin Panel — Security</w:t>
       </w:r>
     </w:p>
     <w:p>
       <w:pPr>
         <w:pStyle w:val="ListBullet"/>
+        <w:spacing w:after="60"/>
       </w:pPr>
-      <w:r/>
       <w:r>
         <w:rPr>
-          <w:b/>
+          <w:sz w:val="20"/>
         </w:rPr>
-        <w:t>Full Certification Track:</w:t>
-      </w:r>
-      <w:r>
-        <w:t xml:space="preserve"> Operating history is 12+ months and entity is for-profit.</w:t>
+        <w:t>Admin Settings is password-protected by default</w:t>
       </w:r>
     </w:p>
     <w:p>
       <w:pPr>
         <w:pStyle w:val="ListBullet"/>
+        <w:spacing w:after="60"/>
       </w:pPr>
-      <w:r/>
       <w:r>
         <w:rPr>
-          <w:b/>
+          <w:sz w:val="20"/>
         </w:rPr>
-        <w:t>Pending B Corp Track:</w:t>
-      </w:r>
-      <w:r>
-        <w:t xml:space="preserve"> Operating history is under 12 months. Requires adopting stakeholder bylaws early.</w:t>
+        <w:t>Default password: set by administrator on first use</w:t>
       </w:r>
     </w:p>
     <w:p>
       <w:pPr>
         <w:pStyle w:val="ListBullet"/>
+        <w:spacing w:after="60"/>
       </w:pPr>
-      <w:r/>
       <w:r>
         <w:rPr>
-          <w:b/>
+          <w:sz w:val="20"/>
         </w:rPr>
-        <w:t>NGO / Charity Disqualification:</w:t>
-      </w:r>
-      <w:r>
-        <w:t xml:space="preserve"> Non-profits cannot certify as B-Corps.</w:t>
-      </w:r>
-    </w:p>
-    <w:p>
-      <w:pPr>
-        <w:pStyle w:val="Heading2"/>
-      </w:pPr>
-      <w:r>
-        <w:t>Projected Annual Fees</w:t>
-      </w:r>
-    </w:p>
-    <w:p>
-      <w:r>
-        <w:t>The projected annual fees are updated based on your revenue range:</w:t>
+        <w:t>To disable password: Admin Settings → Admin Security → untick 'Require password'</w:t>
       </w:r>
     </w:p>
     <w:p>
       <w:pPr>
         <w:pStyle w:val="ListBullet"/>
+        <w:spacing w:after="60"/>
       </w:pPr>
-      <w:r/>
       <w:r>
         <w:rPr>
-          <w:b/>
+          <w:sz w:val="20"/>
         </w:rPr>
-        <w:t>Under $150k:</w:t>
+        <w:t>API keys shown as ●●●● in the input field — never visible in GitHub or any file</w:t>
       </w:r>
-      <w:r>
-        <w:t xml:space="preserve"> </w:t>
-      </w:r>
-      <w:r>
-        <w:rPr>
-          <w:rFonts w:ascii="Consolas" w:hAnsi="Consolas"/>
-          <w:color w:val="C0392B"/>
-          <w:sz w:val="19"/>
-        </w:rPr>
-        <w:t>$1,000 / year</w:t>
-      </w:r>
-      <w:r/>
     </w:p>
     <w:p>
       <w:pPr>
-        <w:pStyle w:val="ListBullet"/>
+        <w:pStyle w:val="Heading1"/>
+        <w:spacing w:before="280" w:after="80"/>
       </w:pPr>
-      <w:r/>
       <w:r>
         <w:rPr>
-          <w:b/>
+          <w:color w:val="1A6B3C"/>
         </w:rPr>
-        <w:t>Under $1m:</w:t>
+        <w:t>Quick Troubleshooting</w:t>
       </w:r>
-      <w:r>
-        <w:t xml:space="preserve"> </w:t>
-      </w:r>
+    </w:p>
+    <w:tbl>
+      <w:tblPr>
+        <w:tblStyle w:val="TableGrid"/>
+        <w:tblW w:type="auto" w:w="0"/>
+        <w:tblLook w:firstColumn="1" w:firstRow="1" w:lastColumn="0" w:lastRow="0" w:noHBand="0" w:noVBand="1" w:val="04A0"/>
+      </w:tblPr>
+      <w:tblGrid>
+        <w:gridCol w:w="4986"/>
+        <w:gridCol w:w="4986"/>
+      </w:tblGrid>
+      <w:tr>
+        <w:tc>
+          <w:tcPr>
+            <w:tcW w:type="dxa" w:w="4986"/>
+            <w:shd w:val="clear" w:color="auto" w:fill="1A6B3C"/>
+          </w:tcPr>
+          <w:p>
+            <w:r>
+              <w:rPr>
+                <w:b/>
+                <w:color w:val="FFFFFF"/>
+                <w:sz w:val="18"/>
+              </w:rPr>
+              <w:t>Issue</w:t>
+            </w:r>
+          </w:p>
+        </w:tc>
+        <w:tc>
+          <w:tcPr>
+            <w:tcW w:type="dxa" w:w="4986"/>
+            <w:shd w:val="clear" w:color="auto" w:fill="1A6B3C"/>
+          </w:tcPr>
+          <w:p>
+            <w:r>
+              <w:rPr>
+                <w:b/>
+                <w:color w:val="FFFFFF"/>
+                <w:sz w:val="18"/>
+              </w:rPr>
+              <w:t>Solution</w:t>
+            </w:r>
+          </w:p>
+        </w:tc>
+      </w:tr>
+      <w:tr>
+        <w:tc>
+          <w:tcPr>
+            <w:tcW w:type="dxa" w:w="4986"/>
+            <w:shd w:val="clear" w:color="auto" w:fill="F6F9F7"/>
+          </w:tcPr>
+          <w:p>
+            <w:r>
+              <w:rPr>
+                <w:sz w:val="18"/>
+              </w:rPr>
+              <w:t>AI content not appearing</w:t>
+            </w:r>
+          </w:p>
+        </w:tc>
+        <w:tc>
+          <w:tcPr>
+            <w:tcW w:type="dxa" w:w="4986"/>
+            <w:shd w:val="clear" w:color="auto" w:fill="F6F9F7"/>
+          </w:tcPr>
+          <w:p>
+            <w:r>
+              <w:rPr>
+                <w:sz w:val="18"/>
+              </w:rPr>
+              <w:t>Check My AI Settings on welcome screen — key may not be saved</w:t>
+            </w:r>
+          </w:p>
+        </w:tc>
+      </w:tr>
+      <w:tr>
+        <w:tc>
+          <w:tcPr>
+            <w:tcW w:type="dxa" w:w="4986"/>
+            <w:shd w:val="clear" w:color="auto" w:fill="FFFFFF"/>
+          </w:tcPr>
+          <w:p>
+            <w:r>
+              <w:rPr>
+                <w:sz w:val="18"/>
+              </w:rPr>
+              <w:t>Logo showing unexpectedly</w:t>
+            </w:r>
+          </w:p>
+        </w:tc>
+        <w:tc>
+          <w:tcPr>
+            <w:tcW w:type="dxa" w:w="4986"/>
+            <w:shd w:val="clear" w:color="auto" w:fill="FFFFFF"/>
+          </w:tcPr>
+          <w:p>
+            <w:r>
+              <w:rPr>
+                <w:sz w:val="18"/>
+              </w:rPr>
+              <w:t>Admin Settings → Branding → untick 'Show i-nocarbon branding &amp; logo'</w:t>
+            </w:r>
+          </w:p>
+        </w:tc>
+      </w:tr>
+      <w:tr>
+        <w:tc>
+          <w:tcPr>
+            <w:tcW w:type="dxa" w:w="4986"/>
+            <w:shd w:val="clear" w:color="auto" w:fill="F6F9F7"/>
+          </w:tcPr>
+          <w:p>
+            <w:r>
+              <w:rPr>
+                <w:sz w:val="18"/>
+              </w:rPr>
+              <w:t>Progress lost</w:t>
+            </w:r>
+          </w:p>
+        </w:tc>
+        <w:tc>
+          <w:tcPr>
+            <w:tcW w:type="dxa" w:w="4986"/>
+            <w:shd w:val="clear" w:color="auto" w:fill="F6F9F7"/>
+          </w:tcPr>
+          <w:p>
+            <w:r>
+              <w:rPr>
+                <w:sz w:val="18"/>
+              </w:rPr>
+              <w:t>Browser cache cleared — use Download Backup regularly</w:t>
+            </w:r>
+          </w:p>
+        </w:tc>
+      </w:tr>
+      <w:tr>
+        <w:tc>
+          <w:tcPr>
+            <w:tcW w:type="dxa" w:w="4986"/>
+            <w:shd w:val="clear" w:color="auto" w:fill="FFFFFF"/>
+          </w:tcPr>
+          <w:p>
+            <w:r>
+              <w:rPr>
+                <w:sz w:val="18"/>
+              </w:rPr>
+              <w:t>Want to edit answers</w:t>
+            </w:r>
+          </w:p>
+        </w:tc>
+        <w:tc>
+          <w:tcPr>
+            <w:tcW w:type="dxa" w:w="4986"/>
+            <w:shd w:val="clear" w:color="auto" w:fill="FFFFFF"/>
+          </w:tcPr>
+          <w:p>
+            <w:r>
+              <w:rPr>
+                <w:sz w:val="18"/>
+              </w:rPr>
+              <w:t>Click '✏️ Edit Answers' on results screen (not Retake)</w:t>
+            </w:r>
+          </w:p>
+        </w:tc>
+      </w:tr>
+      <w:tr>
+        <w:tc>
+          <w:tcPr>
+            <w:tcW w:type="dxa" w:w="4986"/>
+            <w:shd w:val="clear" w:color="auto" w:fill="F6F9F7"/>
+          </w:tcPr>
+          <w:p>
+            <w:r>
+              <w:rPr>
+                <w:sz w:val="18"/>
+              </w:rPr>
+              <w:t>PDF missing AI summary</w:t>
+            </w:r>
+          </w:p>
+        </w:tc>
+        <w:tc>
+          <w:tcPr>
+            <w:tcW w:type="dxa" w:w="4986"/>
+            <w:shd w:val="clear" w:color="auto" w:fill="F6F9F7"/>
+          </w:tcPr>
+          <w:p>
+            <w:r>
+              <w:rPr>
+                <w:sz w:val="18"/>
+              </w:rPr>
+              <w:t>Enable AI first, then click Export PDF</w:t>
+            </w:r>
+          </w:p>
+        </w:tc>
+      </w:tr>
+      <w:tr>
+        <w:tc>
+          <w:tcPr>
+            <w:tcW w:type="dxa" w:w="4986"/>
+            <w:shd w:val="clear" w:color="auto" w:fill="FFFFFF"/>
+          </w:tcPr>
+          <w:p>
+            <w:r>
+              <w:rPr>
+                <w:sz w:val="18"/>
+              </w:rPr>
+              <w:t>Admin panel won't open</w:t>
+            </w:r>
+          </w:p>
+        </w:tc>
+        <w:tc>
+          <w:tcPr>
+            <w:tcW w:type="dxa" w:w="4986"/>
+            <w:shd w:val="clear" w:color="auto" w:fill="FFFFFF"/>
+          </w:tcPr>
+          <w:p>
+            <w:r>
+              <w:rPr>
+                <w:sz w:val="18"/>
+              </w:rPr>
+              <w:t>Enter the admin password set during setup</w:t>
+            </w:r>
+          </w:p>
+        </w:tc>
+      </w:tr>
+    </w:tbl>
+    <w:p/>
+    <w:p/>
+    <w:p>
+      <w:pPr>
+        <w:jc w:val="center"/>
+      </w:pPr>
       <w:r>
         <w:rPr>
-          <w:rFonts w:ascii="Consolas" w:hAnsi="Consolas"/>
-          <w:color w:val="C0392B"/>
-          <w:sz w:val="19"/>
+          <w:i/>
+          <w:color w:val="6B8A75"/>
+          <w:sz w:val="16"/>
         </w:rPr>
-        <w:t>$2,000 / year</w:t>
+        <w:t>ESG Health Check V4.1  |  i-nocarbon  |  info@i-nocarbon.com  |  www.i-nocarbon.com  |  June 2026</w:t>
       </w:r>
-      <w:r/>
-    </w:p>
-    <w:p>
-      <w:pPr>
-        <w:pStyle w:val="ListBullet"/>
-      </w:pPr>
-      <w:r/>
-      <w:r>
-        <w:rPr>
-          <w:b/>
-        </w:rPr>
-        <w:t>Under $5m:</w:t>
-      </w:r>
-      <w:r>
-        <w:t xml:space="preserve"> </w:t>
-      </w:r>
-      <w:r>
-        <w:rPr>
-          <w:rFonts w:ascii="Consolas" w:hAnsi="Consolas"/>
-          <w:color w:val="C0392B"/>
-          <w:sz w:val="19"/>
-        </w:rPr>
-        <w:t>$3,500 / year</w:t>
-      </w:r>
-      <w:r/>
-    </w:p>
-    <w:p>
-      <w:pPr>
-        <w:pStyle w:val="ListBullet"/>
-      </w:pPr>
-      <w:r/>
-      <w:r>
-        <w:rPr>
-          <w:b/>
-        </w:rPr>
-        <w:t>Under $10m:</w:t>
-      </w:r>
-      <w:r>
-        <w:t xml:space="preserve"> </w:t>
-      </w:r>
-      <w:r>
-        <w:rPr>
-          <w:rFonts w:ascii="Consolas" w:hAnsi="Consolas"/>
-          <w:color w:val="C0392B"/>
-          <w:sz w:val="19"/>
-        </w:rPr>
-        <w:t>$5,000 / year</w:t>
-      </w:r>
-      <w:r/>
-    </w:p>
-    <w:p>
-      <w:pPr>
-        <w:pStyle w:val="ListBullet"/>
-      </w:pPr>
-      <w:r/>
-      <w:r>
-        <w:rPr>
-          <w:b/>
-        </w:rPr>
-        <w:t>Under $50m:</w:t>
-      </w:r>
-      <w:r>
-        <w:t xml:space="preserve"> </w:t>
-      </w:r>
-      <w:r>
-        <w:rPr>
-          <w:rFonts w:ascii="Consolas" w:hAnsi="Consolas"/>
-          <w:color w:val="C0392B"/>
-          <w:sz w:val="19"/>
-        </w:rPr>
-        <w:t>$10,000 / year</w:t>
-      </w:r>
-      <w:r/>
-    </w:p>
-    <w:p>
-      <w:pPr>
-        <w:pStyle w:val="ListBullet"/>
-      </w:pPr>
-      <w:r/>
-      <w:r>
-        <w:rPr>
-          <w:b/>
-        </w:rPr>
-        <w:t>Above $50m:</w:t>
-      </w:r>
-      <w:r>
-        <w:t xml:space="preserve"> </w:t>
-      </w:r>
-      <w:r>
-        <w:rPr>
-          <w:rFonts w:ascii="Consolas" w:hAnsi="Consolas"/>
-          <w:color w:val="C0392B"/>
-          <w:sz w:val="19"/>
-        </w:rPr>
-        <w:t>$15,000+ / year</w:t>
-      </w:r>
-      <w:r/>
     </w:p>
     <w:sectPr>
       <w:pgSz w:w="12240" w:h="15840"/>
-      <w:pgMar w:top="1440" w:right="1440" w:bottom="1440" w:left="1440" w:header="720" w:footer="720" w:gutter="0"/>
+      <w:pgMar w:top="1020" w:right="1134" w:bottom="1020" w:left="1134" w:header="720" w:footer="720" w:gutter="0"/>
       <w:cols w:space="720"/>
       <w:docGrid w:linePitch="360"/>
     </w:sectPr>
@@ -2647,11 +2414,6 @@
     <w:name w:val="Normal"/>
     <w:qFormat/>
     <w:rsid w:val="00FC693F"/>
-    <w:rPr>
-      <w:rFonts w:ascii="Arial" w:hAnsi="Arial"/>
-      <w:color w:val="2D4A38"/>
-      <w:sz w:val="21"/>
-    </w:rPr>
   </w:style>
   <w:style w:type="paragraph" w:styleId="Header">
     <w:name w:val="header"/>
@@ -2708,15 +2470,15 @@
     <w:pPr>
       <w:keepNext/>
       <w:keepLines/>
-      <w:spacing w:before="320" w:after="160"/>
+      <w:spacing w:before="480" w:after="0"/>
       <w:outlineLvl w:val="0"/>
     </w:pPr>
     <w:rPr>
-      <w:rFonts w:asciiTheme="majorHAnsi" w:eastAsiaTheme="majorEastAsia" w:hAnsiTheme="majorHAnsi" w:cstheme="majorBidi" w:ascii="Arial" w:hAnsi="Arial"/>
+      <w:rFonts w:asciiTheme="majorHAnsi" w:eastAsiaTheme="majorEastAsia" w:hAnsiTheme="majorHAnsi" w:cstheme="majorBidi"/>
       <w:b/>
       <w:bCs/>
-      <w:color w:val="1A6B3C"/>
-      <w:sz w:val="36"/>
+      <w:color w:val="365F91" w:themeColor="accent1" w:themeShade="BF"/>
+      <w:sz w:val="28"/>
       <w:szCs w:val="28"/>
     </w:rPr>
   </w:style>
@@ -2732,15 +2494,15 @@
     <w:pPr>
       <w:keepNext/>
       <w:keepLines/>
-      <w:spacing w:before="240" w:after="120"/>
+      <w:spacing w:before="200" w:after="0"/>
       <w:outlineLvl w:val="1"/>
     </w:pPr>
     <w:rPr>
-      <w:rFonts w:asciiTheme="majorHAnsi" w:eastAsiaTheme="majorEastAsia" w:hAnsiTheme="majorHAnsi" w:cstheme="majorBidi" w:ascii="Arial" w:hAnsi="Arial"/>
+      <w:rFonts w:asciiTheme="majorHAnsi" w:eastAsiaTheme="majorEastAsia" w:hAnsiTheme="majorHAnsi" w:cstheme="majorBidi"/>
       <w:b/>
       <w:bCs/>
-      <w:color w:val="1A6B3C"/>
-      <w:sz w:val="28"/>
+      <w:color w:val="4F81BD" w:themeColor="accent1"/>
+      <w:sz w:val="26"/>
       <w:szCs w:val="26"/>
     </w:rPr>
   </w:style>
@@ -2756,15 +2518,14 @@
     <w:pPr>
       <w:keepNext/>
       <w:keepLines/>
-      <w:spacing w:before="200" w:after="80"/>
+      <w:spacing w:before="200" w:after="0"/>
       <w:outlineLvl w:val="2"/>
     </w:pPr>
     <w:rPr>
-      <w:rFonts w:asciiTheme="majorHAnsi" w:eastAsiaTheme="majorEastAsia" w:hAnsiTheme="majorHAnsi" w:cstheme="majorBidi" w:ascii="Arial" w:hAnsi="Arial"/>
+      <w:rFonts w:asciiTheme="majorHAnsi" w:eastAsiaTheme="majorEastAsia" w:hAnsiTheme="majorHAnsi" w:cstheme="majorBidi"/>
       <w:b/>
       <w:bCs/>
-      <w:color w:val="2D4A38"/>
-      <w:sz w:val="24"/>
+      <w:color w:val="4F81BD" w:themeColor="accent1"/>
     </w:rPr>
   </w:style>
   <w:style w:type="paragraph" w:styleId="Heading4">

</xml_diff>